<commit_message>
Replace pluglink template with unlocked version
All 92 required SDTs present, no missing IDs.

Co-Authored-By: Claude Opus 4.6 <noreply@anthropic.com>
</commit_message>
<xml_diff>
--- a/public/pluglink/template.docx
+++ b/public/pluglink/template.docx
@@ -1206,7 +1206,9 @@
                 <w:rPr>
                   <w:rStyle w:val="a0"/>
                   <w:rFonts w:eastAsiaTheme="minorEastAsia"/>
+                  <w:b w:val="0"/>
                   <w:bCs/>
+                  <w:sz w:val="22"/>
                   <w:szCs w:val="16"/>
                 </w:rPr>
               </w:sdtEndPr>
@@ -1318,10 +1320,12 @@
                 <w:rPr>
                   <w:rStyle w:val="a0"/>
                   <w:rFonts w:eastAsiaTheme="minorEastAsia"/>
+                  <w:b w:val="0"/>
                   <w:bCs/>
                   <w:i/>
                   <w:iCs/>
                   <w:color w:val="A6A6A6" w:themeColor="background1" w:themeShade="A6"/>
+                  <w:sz w:val="22"/>
                   <w:szCs w:val="16"/>
                   <w:u w:val="single"/>
                 </w:rPr>
@@ -1850,7 +1854,25 @@
           <w:sz w:val="12"/>
           <w:szCs w:val="12"/>
         </w:rPr>
-        <w:t>제공자”의 비용으로 수행한다. 다만, “서비스 이용자” 또는 충전서비스 이용자의 책임 있는 사유로 전기차 충전 설비가 파손ㆍ멸실ㆍ훼손된 경우, 그 복구 비용은 “서비스 이용자”가 부담한다.</w:t>
+        <w:t xml:space="preserve">제공자”의 비용으로 수행한다. 다만, “서비스 이용자” 또는 충전서비스 이용자의 책임 있는 사유로 전기차 충전 설비가 </w:t>
+      </w:r>
+      <w:proofErr w:type="spellStart"/>
+      <w:r>
+        <w:rPr>
+          <w:w w:val="90"/>
+          <w:sz w:val="12"/>
+          <w:szCs w:val="12"/>
+        </w:rPr>
+        <w:t>파손ㆍ멸실ㆍ훼손된</w:t>
+      </w:r>
+      <w:proofErr w:type="spellEnd"/>
+      <w:r>
+        <w:rPr>
+          <w:w w:val="90"/>
+          <w:sz w:val="12"/>
+          <w:szCs w:val="12"/>
+        </w:rPr>
+        <w:t xml:space="preserve"> 경우, 그 복구 비용은 “서비스 이용자”가 부담한다.</w:t>
       </w:r>
     </w:p>
     <w:p>
@@ -1959,7 +1981,25 @@
           <w:sz w:val="12"/>
           <w:szCs w:val="12"/>
         </w:rPr>
-        <w:t xml:space="preserve"> 전체 주차면의 2% 상당 주차구역에 전기차 전용구역(충전기 설치 및 바닥면 도색 진행)을 설정한다. “서비스 이용자”는 “서비스 제공자”의 동의 없이 전기차 전용구역을 변경할 수 없으며, 임의로 변경할 경우, “서비스</w:t>
+        <w:t xml:space="preserve"> 전체 주차면의 2% 상당 주차구역에 전기차 전용구역(충전기 설치 및 </w:t>
+      </w:r>
+      <w:proofErr w:type="spellStart"/>
+      <w:r>
+        <w:rPr>
+          <w:w w:val="90"/>
+          <w:sz w:val="12"/>
+          <w:szCs w:val="12"/>
+        </w:rPr>
+        <w:t>바닥면</w:t>
+      </w:r>
+      <w:proofErr w:type="spellEnd"/>
+      <w:r>
+        <w:rPr>
+          <w:w w:val="90"/>
+          <w:sz w:val="12"/>
+          <w:szCs w:val="12"/>
+        </w:rPr>
+        <w:t xml:space="preserve"> 도색 진행)을 설정한다. “서비스 이용자”는 “서비스 제공자”의 동의 없이 전기차 전용구역을 변경할 수 없으며, 임의로 변경할 경우, “서비스</w:t>
       </w:r>
       <w:r>
         <w:rPr>
@@ -2254,8 +2294,20 @@
           <w:sz w:val="14"/>
           <w:szCs w:val="14"/>
         </w:rPr>
-        <w:t>3조 계약의 해제ㆍ해지</w:t>
+        <w:t xml:space="preserve">3조 계약의 </w:t>
       </w:r>
+      <w:proofErr w:type="spellStart"/>
+      <w:r>
+        <w:rPr>
+          <w:b/>
+          <w:bCs/>
+          <w:w w:val="90"/>
+          <w:sz w:val="14"/>
+          <w:szCs w:val="14"/>
+        </w:rPr>
+        <w:t>해제ㆍ해지</w:t>
+      </w:r>
+      <w:proofErr w:type="spellEnd"/>
     </w:p>
     <w:p>
       <w:pPr>
@@ -2300,7 +2352,25 @@
           <w:sz w:val="12"/>
           <w:szCs w:val="12"/>
         </w:rPr>
-        <w:t>설치장소 실사 결과 또는 전기차 충전시설 설치공사 과정에서 전기차 충전시설 설치가 불가능하다고 “서비스 제공자”가 합리적으로 판단한 경우(기술적, 법률적으로 불가능한 경우뿐만 아니라 과도한 비용발생, 민원 발생 우려 등 사실상의 제약 사유를 포함함)</w:t>
+        <w:t xml:space="preserve">설치장소 실사 결과 또는 전기차 충전시설 설치공사 과정에서 전기차 충전시설 설치가 불가능하다고 “서비스 제공자”가 합리적으로 판단한 경우(기술적, 법률적으로 불가능한 </w:t>
+      </w:r>
+      <w:proofErr w:type="spellStart"/>
+      <w:r>
+        <w:rPr>
+          <w:w w:val="90"/>
+          <w:sz w:val="12"/>
+          <w:szCs w:val="12"/>
+        </w:rPr>
+        <w:t>경우뿐만</w:t>
+      </w:r>
+      <w:proofErr w:type="spellEnd"/>
+      <w:r>
+        <w:rPr>
+          <w:w w:val="90"/>
+          <w:sz w:val="12"/>
+          <w:szCs w:val="12"/>
+        </w:rPr>
+        <w:t xml:space="preserve"> 아니라 과도한 비용발생, 민원 발생 우려 등 사실상의 제약 사유를 포함함)</w:t>
       </w:r>
     </w:p>
     <w:p>
@@ -3282,7 +3352,6 @@
           <w:szCs w:val="40"/>
         </w:rPr>
       </w:pPr>
-      <w:proofErr w:type="gramStart"/>
       <w:r>
         <w:rPr>
           <w:rFonts w:hint="eastAsia"/>
@@ -3291,18 +3360,7 @@
           <w:sz w:val="40"/>
           <w:szCs w:val="40"/>
         </w:rPr>
-        <w:t>합 의</w:t>
-      </w:r>
-      <w:proofErr w:type="gramEnd"/>
-      <w:r>
-        <w:rPr>
-          <w:rFonts w:hint="eastAsia"/>
-          <w:b/>
-          <w:bCs/>
-          <w:sz w:val="40"/>
-          <w:szCs w:val="40"/>
-        </w:rPr>
-        <w:t xml:space="preserve"> 서</w:t>
+        <w:t>합 의 서</w:t>
       </w:r>
     </w:p>
     <w:p>
@@ -4343,7 +4401,23 @@
           <w:sz w:val="18"/>
           <w:szCs w:val="18"/>
         </w:rPr>
-        <w:t xml:space="preserve"> 536-87-02226</w:t>
+        <w:t xml:space="preserve"> 536-87-02</w:t>
+      </w:r>
+      <w:r>
+        <w:rPr>
+          <w:rFonts w:hint="eastAsia"/>
+          <w:sz w:val="18"/>
+          <w:szCs w:val="18"/>
+        </w:rPr>
+        <w:t>2</w:t>
+      </w:r>
+      <w:r>
+        <w:rPr>
+          <w:rFonts w:hint="eastAsia"/>
+          <w:sz w:val="18"/>
+          <w:szCs w:val="18"/>
+        </w:rPr>
+        <w:t>26</w:t>
       </w:r>
     </w:p>
     <w:p>
@@ -4779,23 +4853,7 @@
           <w:sz w:val="18"/>
           <w:szCs w:val="18"/>
         </w:rPr>
-        <w:t xml:space="preserve">    5. 기타 필요 </w:t>
-      </w:r>
-      <w:proofErr w:type="gramStart"/>
-      <w:r>
-        <w:rPr>
-          <w:sz w:val="18"/>
-          <w:szCs w:val="18"/>
-        </w:rPr>
-        <w:t>시 :</w:t>
-      </w:r>
-      <w:proofErr w:type="gramEnd"/>
-      <w:r>
-        <w:rPr>
-          <w:sz w:val="18"/>
-          <w:szCs w:val="18"/>
-        </w:rPr>
-        <w:t xml:space="preserve"> 전기차 충전기 설치 공사에 필요한 경우에 한함</w:t>
+        <w:t xml:space="preserve">    5. 기타 필요 시 : 전기차 충전기 설치 공사에 필요한 경우에 한함</w:t>
       </w:r>
     </w:p>
     <w:p>
@@ -4815,7 +4873,6 @@
           <w:szCs w:val="18"/>
         </w:rPr>
       </w:pPr>
-      <w:proofErr w:type="gramStart"/>
       <w:r>
         <w:rPr>
           <w:rFonts w:hint="eastAsia"/>
@@ -4829,15 +4886,7 @@
           <w:sz w:val="18"/>
           <w:szCs w:val="18"/>
         </w:rPr>
-        <w:t xml:space="preserve">  호</w:t>
-      </w:r>
-      <w:proofErr w:type="gramEnd"/>
-      <w:r>
-        <w:rPr>
-          <w:sz w:val="18"/>
-          <w:szCs w:val="18"/>
-        </w:rPr>
-        <w:t xml:space="preserve"> : </w:t>
+        <w:t xml:space="preserve">  호 : </w:t>
       </w:r>
       <w:bookmarkStart w:id="17" w:name="CustName9"/>
       <w:bookmarkEnd w:id="17"/>
@@ -4886,7 +4935,6 @@
           <w:szCs w:val="18"/>
         </w:rPr>
       </w:pPr>
-      <w:proofErr w:type="gramStart"/>
       <w:r>
         <w:rPr>
           <w:rFonts w:hint="eastAsia"/>
@@ -4908,15 +4956,7 @@
           <w:sz w:val="18"/>
           <w:szCs w:val="18"/>
         </w:rPr>
-        <w:t>소</w:t>
-      </w:r>
-      <w:proofErr w:type="gramEnd"/>
-      <w:r>
-        <w:rPr>
-          <w:sz w:val="18"/>
-          <w:szCs w:val="18"/>
-        </w:rPr>
-        <w:t xml:space="preserve"> : </w:t>
+        <w:t xml:space="preserve">소 : </w:t>
       </w:r>
       <w:bookmarkStart w:id="18" w:name="CustAddr4"/>
       <w:bookmarkEnd w:id="18"/>
@@ -5312,6 +5352,7 @@
           <w:sz w:val="40"/>
           <w:szCs w:val="40"/>
         </w:rPr>
+        <w:lastRenderedPageBreak/>
         <mc:AlternateContent>
           <mc:Choice Requires="wps">
             <w:drawing>
@@ -5780,7 +5821,7 @@
           <w:szCs w:val="22"/>
         </w:rPr>
       </w:pPr>
-      <w:proofErr w:type="gramStart"/>
+      <w:proofErr w:type="spellStart"/>
       <w:r>
         <w:rPr>
           <w:rFonts w:hint="eastAsia"/>
@@ -5788,18 +5829,12 @@
         </w:rPr>
         <w:t>단지명</w:t>
       </w:r>
+      <w:proofErr w:type="spellEnd"/>
       <w:r>
         <w:rPr>
           <w:szCs w:val="22"/>
         </w:rPr>
-        <w:t xml:space="preserve"> :</w:t>
-      </w:r>
-      <w:proofErr w:type="gramEnd"/>
-      <w:r>
-        <w:rPr>
-          <w:szCs w:val="22"/>
-        </w:rPr>
-        <w:t xml:space="preserve"> </w:t>
+        <w:t xml:space="preserve"> : </w:t>
       </w:r>
       <w:bookmarkStart w:id="21" w:name="CustName10"/>
       <w:bookmarkEnd w:id="21"/>
@@ -5872,21 +5907,7 @@
         <w:rPr>
           <w:szCs w:val="22"/>
         </w:rPr>
-        <w:t xml:space="preserve"> </w:t>
-      </w:r>
-      <w:proofErr w:type="gramStart"/>
-      <w:r>
-        <w:rPr>
-          <w:szCs w:val="22"/>
-        </w:rPr>
-        <w:t>전화번호 :</w:t>
-      </w:r>
-      <w:proofErr w:type="gramEnd"/>
-      <w:r>
-        <w:rPr>
-          <w:szCs w:val="22"/>
-        </w:rPr>
-        <w:t xml:space="preserve"> </w:t>
+        <w:t xml:space="preserve"> 전화번호 : </w:t>
       </w:r>
       <w:bookmarkStart w:id="22" w:name="CustTel4"/>
       <w:bookmarkEnd w:id="22"/>
@@ -5946,21 +5967,7 @@
         <w:rPr>
           <w:szCs w:val="22"/>
         </w:rPr>
-        <w:t xml:space="preserve"> </w:t>
-      </w:r>
-      <w:proofErr w:type="gramStart"/>
-      <w:r>
-        <w:rPr>
-          <w:szCs w:val="22"/>
-        </w:rPr>
-        <w:t>생년월일 :</w:t>
-      </w:r>
-      <w:proofErr w:type="gramEnd"/>
-      <w:r>
-        <w:rPr>
-          <w:szCs w:val="22"/>
-        </w:rPr>
-        <w:t xml:space="preserve"> </w:t>
+        <w:t xml:space="preserve"> 생년월일 : </w:t>
       </w:r>
       <w:sdt>
         <w:sdtPr>
@@ -6011,16 +6018,8 @@
         <w:rPr>
           <w:szCs w:val="22"/>
         </w:rPr>
-        <w:t xml:space="preserve">관리소장님 </w:t>
+        <w:t>관리소장님 성명 :</w:t>
       </w:r>
-      <w:proofErr w:type="gramStart"/>
-      <w:r>
-        <w:rPr>
-          <w:szCs w:val="22"/>
-        </w:rPr>
-        <w:t>성명 :</w:t>
-      </w:r>
-      <w:proofErr w:type="gramEnd"/>
       <w:r>
         <w:rPr>
           <w:rFonts w:hint="eastAsia"/>
@@ -6541,7 +6540,31 @@
           <w:szCs w:val="32"/>
           <w:u w:val="single"/>
         </w:rPr>
-        <w:t>전기자동차 완속충전시설 설치 신청서</w:t>
+        <w:t xml:space="preserve">전기자동차 </w:t>
+      </w:r>
+      <w:proofErr w:type="spellStart"/>
+      <w:r>
+        <w:rPr>
+          <w:rFonts w:hint="eastAsia"/>
+          <w:b/>
+          <w:bCs/>
+          <w:sz w:val="32"/>
+          <w:szCs w:val="32"/>
+          <w:u w:val="single"/>
+        </w:rPr>
+        <w:t>완속충전시설</w:t>
+      </w:r>
+      <w:proofErr w:type="spellEnd"/>
+      <w:r>
+        <w:rPr>
+          <w:rFonts w:hint="eastAsia"/>
+          <w:b/>
+          <w:bCs/>
+          <w:sz w:val="32"/>
+          <w:szCs w:val="32"/>
+          <w:u w:val="single"/>
+        </w:rPr>
+        <w:t xml:space="preserve"> 설치 신청서</w:t>
       </w:r>
     </w:p>
     <w:tbl>
@@ -6678,8 +6701,18 @@
                 <w:sz w:val="18"/>
                 <w:szCs w:val="18"/>
               </w:rPr>
-              <w:t>보유 주차면수</w:t>
-            </w:r>
+              <w:t xml:space="preserve">보유 </w:t>
+            </w:r>
+            <w:proofErr w:type="spellStart"/>
+            <w:r>
+              <w:rPr>
+                <w:rFonts w:hint="eastAsia"/>
+                <w:sz w:val="18"/>
+                <w:szCs w:val="18"/>
+              </w:rPr>
+              <w:t>주차면수</w:t>
+            </w:r>
+            <w:proofErr w:type="spellEnd"/>
           </w:p>
         </w:tc>
         <w:bookmarkStart w:id="26" w:name="Parkinglot"/>
@@ -7031,18 +7064,8 @@
                 <w:sz w:val="18"/>
                 <w:szCs w:val="18"/>
               </w:rPr>
-              <w:t xml:space="preserve">도로명 </w:t>
-            </w:r>
-            <w:proofErr w:type="gramStart"/>
-            <w:r>
-              <w:rPr>
-                <w:rFonts w:hint="eastAsia"/>
-                <w:sz w:val="18"/>
-                <w:szCs w:val="18"/>
-              </w:rPr>
-              <w:t>주소 :</w:t>
-            </w:r>
-            <w:proofErr w:type="gramEnd"/>
+              <w:t>도로명 주소 :</w:t>
+            </w:r>
             <w:r>
               <w:rPr>
                 <w:rFonts w:hint="eastAsia"/>
@@ -8009,12 +8032,21 @@
                 <w:szCs w:val="18"/>
               </w:rPr>
             </w:pPr>
-            <w:r>
-              <w:rPr>
-                <w:sz w:val="18"/>
-                <w:szCs w:val="18"/>
-              </w:rPr>
-              <w:t>가능하오니 사업수행기관에 필히 확인 후 진행하여 주시기 바랍니다.</w:t>
+            <w:proofErr w:type="spellStart"/>
+            <w:r>
+              <w:rPr>
+                <w:sz w:val="18"/>
+                <w:szCs w:val="18"/>
+              </w:rPr>
+              <w:t>가능하오니</w:t>
+            </w:r>
+            <w:proofErr w:type="spellEnd"/>
+            <w:r>
+              <w:rPr>
+                <w:sz w:val="18"/>
+                <w:szCs w:val="18"/>
+              </w:rPr>
+              <w:t xml:space="preserve"> 사업수행기관에 필히 확인 후 진행하여 주시기 바랍니다.</w:t>
             </w:r>
           </w:p>
         </w:tc>
@@ -8269,17 +8301,17 @@
                 <w:sz w:val="18"/>
                 <w:szCs w:val="18"/>
               </w:rPr>
-              <w:t>『지방세법</w:t>
-            </w:r>
-            <w:proofErr w:type="gramStart"/>
-            <w:r>
-              <w:rPr>
-                <w:sz w:val="18"/>
-                <w:szCs w:val="18"/>
-              </w:rPr>
-              <w:t>』,에</w:t>
-            </w:r>
-            <w:proofErr w:type="gramEnd"/>
+              <w:t>『지방세법』,</w:t>
+            </w:r>
+            <w:proofErr w:type="spellStart"/>
+            <w:r>
+              <w:rPr>
+                <w:sz w:val="18"/>
+                <w:szCs w:val="18"/>
+              </w:rPr>
+              <w:t>에</w:t>
+            </w:r>
+            <w:proofErr w:type="spellEnd"/>
             <w:r>
               <w:rPr>
                 <w:sz w:val="18"/>
@@ -8508,7 +8540,23 @@
                 <w:sz w:val="18"/>
                 <w:szCs w:val="18"/>
               </w:rPr>
-              <w:t>무공해차 통합누리집에 위치, 상태정보 표시</w:t>
+              <w:t xml:space="preserve">무공해차 </w:t>
+            </w:r>
+            <w:proofErr w:type="spellStart"/>
+            <w:r>
+              <w:rPr>
+                <w:sz w:val="18"/>
+                <w:szCs w:val="18"/>
+              </w:rPr>
+              <w:t>통합누리집에</w:t>
+            </w:r>
+            <w:proofErr w:type="spellEnd"/>
+            <w:r>
+              <w:rPr>
+                <w:sz w:val="18"/>
+                <w:szCs w:val="18"/>
+              </w:rPr>
+              <w:t xml:space="preserve"> 위치, 상태정보 표시</w:t>
             </w:r>
           </w:p>
           <w:p>
@@ -8530,7 +8578,23 @@
                 <w:sz w:val="18"/>
                 <w:szCs w:val="18"/>
               </w:rPr>
-              <w:t xml:space="preserve">외부인의 출입을 제한하더라도 무공해차 통합누리집에 충전시설 위치, </w:t>
+              <w:t xml:space="preserve">외부인의 출입을 제한하더라도 무공해차 </w:t>
+            </w:r>
+            <w:proofErr w:type="spellStart"/>
+            <w:r>
+              <w:rPr>
+                <w:sz w:val="18"/>
+                <w:szCs w:val="18"/>
+              </w:rPr>
+              <w:t>통합누리집에</w:t>
+            </w:r>
+            <w:proofErr w:type="spellEnd"/>
+            <w:r>
+              <w:rPr>
+                <w:sz w:val="18"/>
+                <w:szCs w:val="18"/>
+              </w:rPr>
+              <w:t xml:space="preserve"> 충전시설 위치, </w:t>
             </w:r>
             <w:r>
               <w:rPr>
@@ -9486,14 +9550,21 @@
               <w:rPr>
                 <w:sz w:val="24"/>
               </w:rPr>
-              <w:t xml:space="preserve">2026년도 전기차 공용 완속충전시설 설치 보조사업과 관련하여 신청서에 기입한 사항이 </w:t>
-            </w:r>
-            <w:proofErr w:type="gramStart"/>
+              <w:t xml:space="preserve">2026년도 전기차 공용 </w:t>
+            </w:r>
+            <w:proofErr w:type="spellStart"/>
             <w:r>
               <w:rPr>
                 <w:sz w:val="24"/>
               </w:rPr>
-              <w:t>틀림</w:t>
+              <w:t>완속충전시설</w:t>
+            </w:r>
+            <w:proofErr w:type="spellEnd"/>
+            <w:r>
+              <w:rPr>
+                <w:sz w:val="24"/>
+              </w:rPr>
+              <w:t xml:space="preserve"> 설치 보조사업과 관련하여 신청서에 기입한 사항이 틀림</w:t>
             </w:r>
             <w:r>
               <w:rPr>
@@ -9506,14 +9577,7 @@
               <w:rPr>
                 <w:sz w:val="24"/>
               </w:rPr>
-              <w:t>없음을</w:t>
-            </w:r>
-            <w:proofErr w:type="gramEnd"/>
-            <w:r>
-              <w:rPr>
-                <w:sz w:val="24"/>
-              </w:rPr>
-              <w:t xml:space="preserve"> 확인하고 제출합니다.</w:t>
+              <w:t>없음을 확인하고 제출합니다.</w:t>
             </w:r>
           </w:p>
           <w:p>
@@ -9659,7 +9723,6 @@
                 <w:sz w:val="24"/>
               </w:rPr>
             </w:pPr>
-            <w:proofErr w:type="gramStart"/>
             <w:r>
               <w:rPr>
                 <w:rFonts w:hint="eastAsia"/>
@@ -9672,15 +9735,7 @@
                 <w:rFonts w:hint="eastAsia"/>
                 <w:sz w:val="24"/>
               </w:rPr>
-              <w:t>:</w:t>
-            </w:r>
-            <w:proofErr w:type="gramEnd"/>
-            <w:r>
-              <w:rPr>
-                <w:rFonts w:hint="eastAsia"/>
-                <w:sz w:val="24"/>
-              </w:rPr>
-              <w:t xml:space="preserve"> </w:t>
+              <w:t xml:space="preserve">: </w:t>
             </w:r>
             <w:bookmarkStart w:id="36" w:name="CustName5"/>
             <w:bookmarkEnd w:id="36"/>
@@ -9847,7 +9902,17 @@
                 <w:bCs/>
                 <w:szCs w:val="22"/>
               </w:rPr>
-              <w:t xml:space="preserve"> 수집</w:t>
+              <w:t xml:space="preserve"> </w:t>
+            </w:r>
+            <w:proofErr w:type="spellStart"/>
+            <w:r>
+              <w:rPr>
+                <w:rFonts w:hAnsiTheme="minorEastAsia"/>
+                <w:b/>
+                <w:bCs/>
+                <w:szCs w:val="22"/>
+              </w:rPr>
+              <w:t>수집</w:t>
             </w:r>
             <w:r>
               <w:rPr>
@@ -9867,6 +9932,7 @@
               </w:rPr>
               <w:t>이용</w:t>
             </w:r>
+            <w:proofErr w:type="spellEnd"/>
             <w:r>
               <w:rPr>
                 <w:rFonts w:hAnsiTheme="minorEastAsia"/>
@@ -9902,7 +9968,52 @@
                 <w:sz w:val="18"/>
                 <w:szCs w:val="18"/>
               </w:rPr>
-              <w:t>충전인프라 설치 지원과 관련하여 「개인정보보호법」제15조(개인정보의 수집ㆍ이용) 및 제22조에 따라 귀하의 개인정보를 아래와 같이 수집</w:t>
+              <w:t>충전인프라 설치 지원과 관련하여 「</w:t>
+            </w:r>
+            <w:proofErr w:type="spellStart"/>
+            <w:r>
+              <w:rPr>
+                <w:rFonts w:hAnsiTheme="minorEastAsia"/>
+                <w:sz w:val="18"/>
+                <w:szCs w:val="18"/>
+              </w:rPr>
+              <w:t>개인정보보호법」제</w:t>
+            </w:r>
+            <w:proofErr w:type="spellEnd"/>
+            <w:r>
+              <w:rPr>
+                <w:rFonts w:hAnsiTheme="minorEastAsia"/>
+                <w:sz w:val="18"/>
+                <w:szCs w:val="18"/>
+              </w:rPr>
+              <w:t xml:space="preserve">15조(개인정보의 </w:t>
+            </w:r>
+            <w:proofErr w:type="spellStart"/>
+            <w:r>
+              <w:rPr>
+                <w:rFonts w:hAnsiTheme="minorEastAsia"/>
+                <w:sz w:val="18"/>
+                <w:szCs w:val="18"/>
+              </w:rPr>
+              <w:t>수집ㆍ이용</w:t>
+            </w:r>
+            <w:proofErr w:type="spellEnd"/>
+            <w:r>
+              <w:rPr>
+                <w:rFonts w:hAnsiTheme="minorEastAsia"/>
+                <w:sz w:val="18"/>
+                <w:szCs w:val="18"/>
+              </w:rPr>
+              <w:t xml:space="preserve">) 및 제22조에 따라 귀하의 개인정보를 아래와 같이 </w:t>
+            </w:r>
+            <w:proofErr w:type="spellStart"/>
+            <w:r>
+              <w:rPr>
+                <w:rFonts w:hAnsiTheme="minorEastAsia"/>
+                <w:sz w:val="18"/>
+                <w:szCs w:val="18"/>
+              </w:rPr>
+              <w:t>수집</w:t>
             </w:r>
             <w:r>
               <w:rPr>
@@ -9920,6 +10031,7 @@
               </w:rPr>
               <w:t>이용</w:t>
             </w:r>
+            <w:proofErr w:type="spellEnd"/>
             <w:r>
               <w:rPr>
                 <w:rFonts w:hAnsiTheme="minorEastAsia"/>
@@ -9944,7 +10056,25 @@
                 <w:sz w:val="18"/>
                 <w:szCs w:val="18"/>
               </w:rPr>
-              <w:t>다음의 사항에 대해 충분히 읽어보신 후, 동의 여부를 체크, 서명하여 주시기 바랍니다.</w:t>
+              <w:t xml:space="preserve">다음의 사항에 대해 충분히 </w:t>
+            </w:r>
+            <w:proofErr w:type="spellStart"/>
+            <w:r>
+              <w:rPr>
+                <w:rFonts w:hAnsiTheme="minorEastAsia"/>
+                <w:sz w:val="18"/>
+                <w:szCs w:val="18"/>
+              </w:rPr>
+              <w:t>읽어보신</w:t>
+            </w:r>
+            <w:proofErr w:type="spellEnd"/>
+            <w:r>
+              <w:rPr>
+                <w:rFonts w:hAnsiTheme="minorEastAsia"/>
+                <w:sz w:val="18"/>
+                <w:szCs w:val="18"/>
+              </w:rPr>
+              <w:t xml:space="preserve"> 후, 동의 여부를 체크, 서명하여 주시기 바랍니다.</w:t>
             </w:r>
           </w:p>
           <w:p>
@@ -10088,7 +10218,18 @@
                 <w:sz w:val="18"/>
                 <w:szCs w:val="18"/>
               </w:rPr>
-              <w:t>[수집</w:t>
+              <w:t>[</w:t>
+            </w:r>
+            <w:proofErr w:type="spellStart"/>
+            <w:r>
+              <w:rPr>
+                <w:rFonts w:hAnsiTheme="minorEastAsia"/>
+                <w:b/>
+                <w:bCs/>
+                <w:sz w:val="18"/>
+                <w:szCs w:val="18"/>
+              </w:rPr>
+              <w:t>수집</w:t>
             </w:r>
             <w:r>
               <w:rPr>
@@ -10110,6 +10251,7 @@
               </w:rPr>
               <w:t>이용하려는</w:t>
             </w:r>
+            <w:proofErr w:type="spellEnd"/>
             <w:r>
               <w:rPr>
                 <w:rFonts w:hAnsiTheme="minorEastAsia"/>
@@ -10174,7 +10316,18 @@
                 <w:sz w:val="18"/>
                 <w:szCs w:val="18"/>
               </w:rPr>
-              <w:t>[개인정보의 수집</w:t>
+              <w:t xml:space="preserve">[개인정보의 </w:t>
+            </w:r>
+            <w:proofErr w:type="spellStart"/>
+            <w:r>
+              <w:rPr>
+                <w:rFonts w:hAnsiTheme="minorEastAsia"/>
+                <w:b/>
+                <w:bCs/>
+                <w:sz w:val="18"/>
+                <w:szCs w:val="18"/>
+              </w:rPr>
+              <w:t>수집</w:t>
             </w:r>
             <w:r>
               <w:rPr>
@@ -10196,6 +10349,7 @@
               </w:rPr>
               <w:t>이용</w:t>
             </w:r>
+            <w:proofErr w:type="spellEnd"/>
             <w:r>
               <w:rPr>
                 <w:rFonts w:hAnsiTheme="minorEastAsia"/>
@@ -10635,16 +10789,7 @@
                 <w:sz w:val="18"/>
                 <w:szCs w:val="18"/>
               </w:rPr>
-              <w:t xml:space="preserve">주식회사 </w:t>
-            </w:r>
-            <w:proofErr w:type="gramStart"/>
-            <w:r>
-              <w:rPr>
-                <w:rFonts w:hAnsiTheme="minorEastAsia" w:hint="eastAsia"/>
-                <w:sz w:val="18"/>
-                <w:szCs w:val="18"/>
-              </w:rPr>
-              <w:t>플러그링크</w:t>
+              <w:t>주식회사 플러그링크</w:t>
             </w:r>
             <w:r>
               <w:rPr>
@@ -10654,7 +10799,6 @@
               </w:rPr>
               <w:t xml:space="preserve"> )</w:t>
             </w:r>
-            <w:proofErr w:type="gramEnd"/>
           </w:p>
           <w:p>
             <w:pPr>
@@ -10675,10 +10819,46 @@
                 <w:sz w:val="18"/>
                 <w:szCs w:val="18"/>
               </w:rPr>
-              <w:t xml:space="preserve">[개인정보를 </w:t>
-            </w:r>
-            <w:proofErr w:type="gramStart"/>
-            <w:r>
+              <w:t>[개인정보를 제공 받는 자]</w:t>
+            </w:r>
+          </w:p>
+          <w:p>
+            <w:pPr>
+              <w:jc w:val="both"/>
+              <w:rPr>
+                <w:rFonts w:hAnsiTheme="minorEastAsia"/>
+                <w:sz w:val="18"/>
+                <w:szCs w:val="18"/>
+              </w:rPr>
+            </w:pPr>
+            <w:r>
+              <w:rPr>
+                <w:rFonts w:ascii="Noto Sans KR" w:eastAsia="Noto Sans KR" w:hAnsi="Noto Sans KR" w:cs="Noto Sans KR" w:hint="eastAsia"/>
+                <w:sz w:val="18"/>
+                <w:szCs w:val="18"/>
+              </w:rPr>
+              <w:t>・</w:t>
+            </w:r>
+            <w:r>
+              <w:rPr>
+                <w:rFonts w:hAnsiTheme="minorEastAsia" w:cs="맑은 고딕" w:hint="eastAsia"/>
+                <w:sz w:val="18"/>
+                <w:szCs w:val="18"/>
+              </w:rPr>
+              <w:t>기후에너지환경부</w:t>
+            </w:r>
+            <w:r>
+              <w:rPr>
+                <w:rFonts w:hAnsiTheme="minorEastAsia"/>
+                <w:sz w:val="18"/>
+                <w:szCs w:val="18"/>
+              </w:rPr>
+              <w:t>, 한국환경공단, 한국자동차환경협회</w:t>
+            </w:r>
+          </w:p>
+          <w:p>
+            <w:pPr>
+              <w:jc w:val="both"/>
               <w:rPr>
                 <w:rFonts w:hAnsiTheme="minorEastAsia"/>
                 <w:b/>
@@ -10686,9 +10866,7 @@
                 <w:sz w:val="18"/>
                 <w:szCs w:val="18"/>
               </w:rPr>
-              <w:t>제공 받는</w:t>
-            </w:r>
-            <w:proofErr w:type="gramEnd"/>
+            </w:pPr>
             <w:r>
               <w:rPr>
                 <w:rFonts w:hAnsiTheme="minorEastAsia"/>
@@ -10697,7 +10875,7 @@
                 <w:sz w:val="18"/>
                 <w:szCs w:val="18"/>
               </w:rPr>
-              <w:t xml:space="preserve"> 자]</w:t>
+              <w:t>[개인정보를 위탁·제공 받는 자의 개인정보 이용목적]</w:t>
             </w:r>
           </w:p>
           <w:p>
@@ -10719,19 +10897,37 @@
             </w:r>
             <w:r>
               <w:rPr>
-                <w:rFonts w:hAnsiTheme="minorEastAsia" w:cs="맑은 고딕" w:hint="eastAsia"/>
-                <w:sz w:val="18"/>
-                <w:szCs w:val="18"/>
-              </w:rPr>
-              <w:t>기후에너지환경부</w:t>
-            </w:r>
-            <w:r>
-              <w:rPr>
                 <w:rFonts w:hAnsiTheme="minorEastAsia"/>
                 <w:sz w:val="18"/>
                 <w:szCs w:val="18"/>
               </w:rPr>
-              <w:t>, 한국환경공단, 한국자동차환경협회</w:t>
+              <w:t xml:space="preserve"> (충전기 설치사업자) 충전기 설치 절차에 이용</w:t>
+            </w:r>
+          </w:p>
+          <w:p>
+            <w:pPr>
+              <w:jc w:val="both"/>
+              <w:rPr>
+                <w:rFonts w:hAnsiTheme="minorEastAsia"/>
+                <w:sz w:val="18"/>
+                <w:szCs w:val="18"/>
+              </w:rPr>
+            </w:pPr>
+            <w:r>
+              <w:rPr>
+                <w:rFonts w:ascii="Noto Sans KR" w:eastAsia="Noto Sans KR" w:hAnsi="Noto Sans KR" w:cs="Noto Sans KR" w:hint="eastAsia"/>
+                <w:sz w:val="18"/>
+                <w:szCs w:val="18"/>
+              </w:rPr>
+              <w:t>・</w:t>
+            </w:r>
+            <w:r>
+              <w:rPr>
+                <w:rFonts w:hAnsiTheme="minorEastAsia"/>
+                <w:sz w:val="18"/>
+                <w:szCs w:val="18"/>
+              </w:rPr>
+              <w:t xml:space="preserve"> (기후에너지환경부, 한국환경공단, 한국자동차환경협회) 충전기 설치실적, 전산처리 등 관련자료 작성에 이용</w:t>
             </w:r>
           </w:p>
           <w:p>
@@ -10753,125 +10949,7 @@
                 <w:sz w:val="18"/>
                 <w:szCs w:val="18"/>
               </w:rPr>
-              <w:t>[개인정보를 위탁·</w:t>
-            </w:r>
-            <w:proofErr w:type="gramStart"/>
-            <w:r>
-              <w:rPr>
-                <w:rFonts w:hAnsiTheme="minorEastAsia"/>
-                <w:b/>
-                <w:bCs/>
-                <w:sz w:val="18"/>
-                <w:szCs w:val="18"/>
-              </w:rPr>
-              <w:t>제공 받는</w:t>
-            </w:r>
-            <w:proofErr w:type="gramEnd"/>
-            <w:r>
-              <w:rPr>
-                <w:rFonts w:hAnsiTheme="minorEastAsia"/>
-                <w:b/>
-                <w:bCs/>
-                <w:sz w:val="18"/>
-                <w:szCs w:val="18"/>
-              </w:rPr>
-              <w:t xml:space="preserve"> 자의 개인정보 이용목적]</w:t>
-            </w:r>
-          </w:p>
-          <w:p>
-            <w:pPr>
-              <w:jc w:val="both"/>
-              <w:rPr>
-                <w:rFonts w:hAnsiTheme="minorEastAsia"/>
-                <w:sz w:val="18"/>
-                <w:szCs w:val="18"/>
-              </w:rPr>
-            </w:pPr>
-            <w:r>
-              <w:rPr>
-                <w:rFonts w:ascii="Noto Sans KR" w:eastAsia="Noto Sans KR" w:hAnsi="Noto Sans KR" w:cs="Noto Sans KR" w:hint="eastAsia"/>
-                <w:sz w:val="18"/>
-                <w:szCs w:val="18"/>
-              </w:rPr>
-              <w:t>・</w:t>
-            </w:r>
-            <w:r>
-              <w:rPr>
-                <w:rFonts w:hAnsiTheme="minorEastAsia"/>
-                <w:sz w:val="18"/>
-                <w:szCs w:val="18"/>
-              </w:rPr>
-              <w:t xml:space="preserve"> (충전기 설치사업자) 충전기 설치 절차에 이용</w:t>
-            </w:r>
-          </w:p>
-          <w:p>
-            <w:pPr>
-              <w:jc w:val="both"/>
-              <w:rPr>
-                <w:rFonts w:hAnsiTheme="minorEastAsia"/>
-                <w:sz w:val="18"/>
-                <w:szCs w:val="18"/>
-              </w:rPr>
-            </w:pPr>
-            <w:r>
-              <w:rPr>
-                <w:rFonts w:ascii="Noto Sans KR" w:eastAsia="Noto Sans KR" w:hAnsi="Noto Sans KR" w:cs="Noto Sans KR" w:hint="eastAsia"/>
-                <w:sz w:val="18"/>
-                <w:szCs w:val="18"/>
-              </w:rPr>
-              <w:t>・</w:t>
-            </w:r>
-            <w:r>
-              <w:rPr>
-                <w:rFonts w:hAnsiTheme="minorEastAsia"/>
-                <w:sz w:val="18"/>
-                <w:szCs w:val="18"/>
-              </w:rPr>
-              <w:t xml:space="preserve"> (기후에너지환경부, 한국환경공단, 한국자동차환경협회) 충전기 설치실적, 전산처리 등 관련자료 작성에 이용</w:t>
-            </w:r>
-          </w:p>
-          <w:p>
-            <w:pPr>
-              <w:jc w:val="both"/>
-              <w:rPr>
-                <w:rFonts w:hAnsiTheme="minorEastAsia"/>
-                <w:b/>
-                <w:bCs/>
-                <w:sz w:val="18"/>
-                <w:szCs w:val="18"/>
-              </w:rPr>
-            </w:pPr>
-            <w:r>
-              <w:rPr>
-                <w:rFonts w:hAnsiTheme="minorEastAsia"/>
-                <w:b/>
-                <w:bCs/>
-                <w:sz w:val="18"/>
-                <w:szCs w:val="18"/>
-              </w:rPr>
-              <w:t>[개인정보를 위탁·</w:t>
-            </w:r>
-            <w:proofErr w:type="gramStart"/>
-            <w:r>
-              <w:rPr>
-                <w:rFonts w:hAnsiTheme="minorEastAsia"/>
-                <w:b/>
-                <w:bCs/>
-                <w:sz w:val="18"/>
-                <w:szCs w:val="18"/>
-              </w:rPr>
-              <w:t>제공 받는</w:t>
-            </w:r>
-            <w:proofErr w:type="gramEnd"/>
-            <w:r>
-              <w:rPr>
-                <w:rFonts w:hAnsiTheme="minorEastAsia"/>
-                <w:b/>
-                <w:bCs/>
-                <w:sz w:val="18"/>
-                <w:szCs w:val="18"/>
-              </w:rPr>
-              <w:t xml:space="preserve"> 자의 개인정보 이용 및 보유기간]</w:t>
+              <w:t>[개인정보를 위탁·제공 받는 자의 개인정보 이용 및 보유기간]</w:t>
             </w:r>
           </w:p>
           <w:p>
@@ -11065,7 +11143,16 @@
                 <w:sz w:val="18"/>
                 <w:szCs w:val="18"/>
               </w:rPr>
-              <w:t>본인은 본 “개인정보의 수집</w:t>
+              <w:t xml:space="preserve">본인은 본 “개인정보의 </w:t>
+            </w:r>
+            <w:proofErr w:type="spellStart"/>
+            <w:r>
+              <w:rPr>
+                <w:rFonts w:hAnsiTheme="minorEastAsia"/>
+                <w:sz w:val="18"/>
+                <w:szCs w:val="18"/>
+              </w:rPr>
+              <w:t>수집</w:t>
             </w:r>
             <w:r>
               <w:rPr>
@@ -11083,6 +11170,7 @@
               </w:rPr>
               <w:t>이용</w:t>
             </w:r>
+            <w:proofErr w:type="spellEnd"/>
             <w:r>
               <w:rPr>
                 <w:rFonts w:hAnsiTheme="minorEastAsia"/>
@@ -11277,25 +11365,7 @@
                 <w:sz w:val="18"/>
                 <w:szCs w:val="18"/>
               </w:rPr>
-              <w:t xml:space="preserve">신 청 </w:t>
-            </w:r>
-            <w:proofErr w:type="gramStart"/>
-            <w:r>
-              <w:rPr>
-                <w:rFonts w:hAnsiTheme="minorEastAsia" w:hint="eastAsia"/>
-                <w:sz w:val="18"/>
-                <w:szCs w:val="18"/>
-              </w:rPr>
-              <w:t>자 :</w:t>
-            </w:r>
-            <w:proofErr w:type="gramEnd"/>
-            <w:r>
-              <w:rPr>
-                <w:rFonts w:hAnsiTheme="minorEastAsia" w:hint="eastAsia"/>
-                <w:sz w:val="18"/>
-                <w:szCs w:val="18"/>
-              </w:rPr>
-              <w:t xml:space="preserve"> </w:t>
+              <w:t xml:space="preserve">신 청 자 : </w:t>
             </w:r>
             <w:bookmarkStart w:id="39" w:name="CustName7"/>
             <w:bookmarkEnd w:id="39"/>
@@ -11834,17 +11904,7 @@
                 <w:bCs/>
                 <w:sz w:val="24"/>
               </w:rPr>
-              <w:t xml:space="preserve">【구분: 스마트 </w:t>
-            </w:r>
-            <w:proofErr w:type="gramStart"/>
-            <w:r>
-              <w:rPr>
-                <w:rFonts w:asciiTheme="majorHAnsi" w:eastAsiaTheme="majorHAnsi" w:hAnsiTheme="majorHAnsi"/>
-                <w:b/>
-                <w:bCs/>
-                <w:sz w:val="24"/>
-              </w:rPr>
-              <w:t xml:space="preserve">충전기( </w:t>
+              <w:t xml:space="preserve">【구분: 스마트 충전기( </w:t>
             </w:r>
             <w:r>
               <w:rPr>
@@ -11853,17 +11913,7 @@
                 <w:bCs/>
                 <w:sz w:val="24"/>
               </w:rPr>
-              <w:t>O</w:t>
-            </w:r>
-            <w:proofErr w:type="gramEnd"/>
-            <w:r>
-              <w:rPr>
-                <w:rFonts w:asciiTheme="majorHAnsi" w:eastAsiaTheme="majorHAnsi" w:hAnsiTheme="majorHAnsi" w:hint="eastAsia"/>
-                <w:b/>
-                <w:bCs/>
-                <w:sz w:val="24"/>
-              </w:rPr>
-              <w:t xml:space="preserve"> </w:t>
+              <w:t xml:space="preserve">O </w:t>
             </w:r>
             <w:r>
               <w:rPr>
@@ -11914,21 +11964,12 @@
                 <w:szCs w:val="20"/>
               </w:rPr>
             </w:pPr>
-            <w:proofErr w:type="gramStart"/>
             <w:r>
               <w:rPr>
                 <w:sz w:val="20"/>
                 <w:szCs w:val="20"/>
               </w:rPr>
-              <w:t xml:space="preserve">(  </w:t>
-            </w:r>
-            <w:proofErr w:type="gramEnd"/>
-            <w:r>
-              <w:rPr>
-                <w:sz w:val="20"/>
-                <w:szCs w:val="20"/>
-              </w:rPr>
-              <w:t xml:space="preserve">   )기</w:t>
+              <w:t>(     )기</w:t>
             </w:r>
           </w:p>
         </w:tc>
@@ -12079,23 +12120,13 @@
                 <w:szCs w:val="20"/>
               </w:rPr>
             </w:pPr>
-            <w:proofErr w:type="gramStart"/>
             <w:r>
               <w:rPr>
                 <w:rFonts w:asciiTheme="majorHAnsi" w:eastAsiaTheme="majorHAnsi" w:hAnsiTheme="majorHAnsi"/>
                 <w:sz w:val="20"/>
                 <w:szCs w:val="20"/>
               </w:rPr>
-              <w:t xml:space="preserve">(  </w:t>
-            </w:r>
-            <w:proofErr w:type="gramEnd"/>
-            <w:r>
-              <w:rPr>
-                <w:rFonts w:asciiTheme="majorHAnsi" w:eastAsiaTheme="majorHAnsi" w:hAnsiTheme="majorHAnsi"/>
-                <w:sz w:val="20"/>
-                <w:szCs w:val="20"/>
-              </w:rPr>
-              <w:t xml:space="preserve">   )기</w:t>
+              <w:t>(     )기</w:t>
             </w:r>
           </w:p>
         </w:tc>
@@ -12137,21 +12168,12 @@
                 <w:szCs w:val="20"/>
               </w:rPr>
             </w:pPr>
-            <w:proofErr w:type="gramStart"/>
             <w:r>
               <w:rPr>
                 <w:sz w:val="20"/>
                 <w:szCs w:val="20"/>
               </w:rPr>
-              <w:t xml:space="preserve">(  </w:t>
-            </w:r>
-            <w:proofErr w:type="gramEnd"/>
-            <w:r>
-              <w:rPr>
-                <w:sz w:val="20"/>
-                <w:szCs w:val="20"/>
-              </w:rPr>
-              <w:t xml:space="preserve">   )기</w:t>
+              <w:t>(     )기</w:t>
             </w:r>
           </w:p>
         </w:tc>
@@ -12190,77 +12212,13 @@
                 <w:szCs w:val="20"/>
               </w:rPr>
             </w:pPr>
-            <w:proofErr w:type="gramStart"/>
             <w:r>
               <w:rPr>
                 <w:rFonts w:asciiTheme="majorHAnsi" w:eastAsiaTheme="majorHAnsi" w:hAnsiTheme="majorHAnsi"/>
                 <w:sz w:val="20"/>
                 <w:szCs w:val="20"/>
               </w:rPr>
-              <w:t xml:space="preserve">(  </w:t>
-            </w:r>
-            <w:proofErr w:type="gramEnd"/>
-            <w:r>
-              <w:rPr>
-                <w:rFonts w:asciiTheme="majorHAnsi" w:eastAsiaTheme="majorHAnsi" w:hAnsiTheme="majorHAnsi"/>
-                <w:sz w:val="20"/>
-                <w:szCs w:val="20"/>
-              </w:rPr>
-              <w:t xml:space="preserve">  )</w:t>
-            </w:r>
-            <w:proofErr w:type="gramStart"/>
-            <w:r>
-              <w:rPr>
-                <w:rFonts w:asciiTheme="majorHAnsi" w:eastAsiaTheme="majorHAnsi" w:hAnsiTheme="majorHAnsi"/>
-                <w:sz w:val="20"/>
-                <w:szCs w:val="20"/>
-              </w:rPr>
-              <w:t>kW  (</w:t>
-            </w:r>
-            <w:proofErr w:type="gramEnd"/>
-            <w:r>
-              <w:rPr>
-                <w:rFonts w:asciiTheme="majorHAnsi" w:eastAsiaTheme="majorHAnsi" w:hAnsiTheme="majorHAnsi"/>
-                <w:sz w:val="20"/>
-                <w:szCs w:val="20"/>
-              </w:rPr>
-              <w:t xml:space="preserve">    )</w:t>
-            </w:r>
-            <w:proofErr w:type="gramStart"/>
-            <w:r>
-              <w:rPr>
-                <w:rFonts w:asciiTheme="majorHAnsi" w:eastAsiaTheme="majorHAnsi" w:hAnsiTheme="majorHAnsi"/>
-                <w:sz w:val="20"/>
-                <w:szCs w:val="20"/>
-              </w:rPr>
-              <w:t>기  케이블</w:t>
-            </w:r>
-            <w:proofErr w:type="gramEnd"/>
-            <w:r>
-              <w:rPr>
-                <w:rFonts w:asciiTheme="majorHAnsi" w:eastAsiaTheme="majorHAnsi" w:hAnsiTheme="majorHAnsi"/>
-                <w:sz w:val="20"/>
-                <w:szCs w:val="20"/>
-              </w:rPr>
-              <w:t xml:space="preserve"> </w:t>
-            </w:r>
-            <w:proofErr w:type="gramStart"/>
-            <w:r>
-              <w:rPr>
-                <w:rFonts w:asciiTheme="majorHAnsi" w:eastAsiaTheme="majorHAnsi" w:hAnsiTheme="majorHAnsi"/>
-                <w:sz w:val="20"/>
-                <w:szCs w:val="20"/>
-              </w:rPr>
-              <w:t xml:space="preserve">(  </w:t>
-            </w:r>
-            <w:proofErr w:type="gramEnd"/>
-            <w:r>
-              <w:rPr>
-                <w:rFonts w:asciiTheme="majorHAnsi" w:eastAsiaTheme="majorHAnsi" w:hAnsiTheme="majorHAnsi"/>
-                <w:sz w:val="20"/>
-                <w:szCs w:val="20"/>
-              </w:rPr>
-              <w:t xml:space="preserve">  )개</w:t>
+              <w:t>(    )kW  (    )기  케이블 (    )개</w:t>
             </w:r>
           </w:p>
         </w:tc>
@@ -12938,7 +12896,25 @@
                 <w:sz w:val="20"/>
                 <w:szCs w:val="20"/>
               </w:rPr>
-              <w:t>설치환경(확인 후 해당란에 체크)</w:t>
+              <w:t xml:space="preserve">설치환경(확인 후 </w:t>
+            </w:r>
+            <w:proofErr w:type="spellStart"/>
+            <w:r>
+              <w:rPr>
+                <w:rFonts w:asciiTheme="majorHAnsi" w:eastAsiaTheme="majorHAnsi" w:hAnsiTheme="majorHAnsi" w:hint="eastAsia"/>
+                <w:sz w:val="20"/>
+                <w:szCs w:val="20"/>
+              </w:rPr>
+              <w:t>해당란에</w:t>
+            </w:r>
+            <w:proofErr w:type="spellEnd"/>
+            <w:r>
+              <w:rPr>
+                <w:rFonts w:asciiTheme="majorHAnsi" w:eastAsiaTheme="majorHAnsi" w:hAnsiTheme="majorHAnsi" w:hint="eastAsia"/>
+                <w:sz w:val="20"/>
+                <w:szCs w:val="20"/>
+              </w:rPr>
+              <w:t xml:space="preserve"> 체크)</w:t>
             </w:r>
           </w:p>
         </w:tc>
@@ -13046,6 +13022,7 @@
                 <w:szCs w:val="20"/>
               </w:rPr>
             </w:pPr>
+            <w:proofErr w:type="spellStart"/>
             <w:r>
               <w:rPr>
                 <w:rFonts w:asciiTheme="majorHAnsi" w:eastAsiaTheme="majorHAnsi" w:hAnsiTheme="majorHAnsi" w:hint="eastAsia"/>
@@ -13054,6 +13031,7 @@
               </w:rPr>
               <w:t>소유주과의관계</w:t>
             </w:r>
+            <w:proofErr w:type="spellEnd"/>
           </w:p>
         </w:tc>
         <w:tc>
@@ -13069,6 +13047,7 @@
                 <w:szCs w:val="20"/>
               </w:rPr>
             </w:pPr>
+            <w:proofErr w:type="spellStart"/>
             <w:r>
               <w:rPr>
                 <w:rFonts w:asciiTheme="majorHAnsi" w:eastAsiaTheme="majorHAnsi" w:hAnsiTheme="majorHAnsi" w:hint="eastAsia"/>
@@ -13077,6 +13056,7 @@
               </w:rPr>
               <w:t>전력인입</w:t>
             </w:r>
+            <w:proofErr w:type="spellEnd"/>
           </w:p>
         </w:tc>
         <w:tc>
@@ -13229,7 +13209,6 @@
                 </w:r>
               </w:sdtContent>
             </w:sdt>
-            <w:proofErr w:type="gramStart"/>
             <w:r>
               <w:rPr>
                 <w:rFonts w:hint="eastAsia"/>
@@ -13238,7 +13217,6 @@
               </w:rPr>
               <w:t>실내,지하</w:t>
             </w:r>
-            <w:proofErr w:type="gramEnd"/>
           </w:p>
         </w:tc>
         <w:tc>
@@ -13423,6 +13401,7 @@
                 </w:r>
               </w:sdtContent>
             </w:sdt>
+            <w:proofErr w:type="spellStart"/>
             <w:r>
               <w:rPr>
                 <w:rFonts w:asciiTheme="majorHAnsi" w:eastAsiaTheme="majorHAnsi" w:hAnsiTheme="majorHAnsi" w:hint="eastAsia"/>
@@ -13431,6 +13410,7 @@
               </w:rPr>
               <w:t>벽부형</w:t>
             </w:r>
+            <w:proofErr w:type="spellEnd"/>
           </w:p>
         </w:tc>
         <w:tc>
@@ -13559,16 +13539,22 @@
                 </w:r>
               </w:sdtContent>
             </w:sdt>
-            <w:proofErr w:type="gramStart"/>
             <w:r>
               <w:rPr>
                 <w:rFonts w:hint="eastAsia"/>
                 <w:sz w:val="20"/>
                 <w:szCs w:val="20"/>
               </w:rPr>
-              <w:t>실외,노상</w:t>
-            </w:r>
-            <w:proofErr w:type="gramEnd"/>
+              <w:t>실외,</w:t>
+            </w:r>
+            <w:r>
+              <w:rPr>
+                <w:rFonts w:hint="eastAsia"/>
+                <w:sz w:val="20"/>
+                <w:szCs w:val="20"/>
+              </w:rPr>
+              <w:t>3</w:t>
+            </w:r>
           </w:p>
         </w:tc>
         <w:tc>
@@ -13705,6 +13691,7 @@
                 </w:r>
               </w:sdtContent>
             </w:sdt>
+            <w:proofErr w:type="spellStart"/>
             <w:r>
               <w:rPr>
                 <w:rFonts w:asciiTheme="majorHAnsi" w:eastAsiaTheme="majorHAnsi" w:hAnsiTheme="majorHAnsi" w:hint="eastAsia"/>
@@ -13713,6 +13700,7 @@
               </w:rPr>
               <w:t>한전불입</w:t>
             </w:r>
+            <w:proofErr w:type="spellEnd"/>
           </w:p>
         </w:tc>
         <w:tc>
@@ -14699,13 +14687,23 @@
                 <w:szCs w:val="20"/>
               </w:rPr>
             </w:pPr>
+            <w:proofErr w:type="spellStart"/>
             <w:r>
               <w:rPr>
                 <w:rFonts w:asciiTheme="majorHAnsi" w:eastAsiaTheme="majorHAnsi" w:hAnsiTheme="majorHAnsi" w:hint="eastAsia"/>
                 <w:sz w:val="20"/>
                 <w:szCs w:val="20"/>
               </w:rPr>
-              <w:t>고압시 변압기 용량 확인</w:t>
+              <w:t>고압시</w:t>
+            </w:r>
+            <w:proofErr w:type="spellEnd"/>
+            <w:r>
+              <w:rPr>
+                <w:rFonts w:asciiTheme="majorHAnsi" w:eastAsiaTheme="majorHAnsi" w:hAnsiTheme="majorHAnsi" w:hint="eastAsia"/>
+                <w:sz w:val="20"/>
+                <w:szCs w:val="20"/>
+              </w:rPr>
+              <w:t xml:space="preserve"> 변압기 용량 확인</w:t>
             </w:r>
           </w:p>
         </w:tc>
@@ -15019,13 +15017,23 @@
                 <w:szCs w:val="20"/>
               </w:rPr>
             </w:pPr>
+            <w:proofErr w:type="spellStart"/>
             <w:r>
               <w:rPr>
                 <w:rFonts w:hint="eastAsia"/>
                 <w:sz w:val="20"/>
                 <w:szCs w:val="20"/>
               </w:rPr>
-              <w:t>운영중 또는</w:t>
+              <w:t>운영중</w:t>
+            </w:r>
+            <w:proofErr w:type="spellEnd"/>
+            <w:r>
+              <w:rPr>
+                <w:rFonts w:hint="eastAsia"/>
+                <w:sz w:val="20"/>
+                <w:szCs w:val="20"/>
+              </w:rPr>
+              <w:t xml:space="preserve"> 또는</w:t>
             </w:r>
           </w:p>
           <w:p>
@@ -15098,7 +15106,6 @@
               </w:rPr>
               <w:t xml:space="preserve"> </w:t>
             </w:r>
-            <w:proofErr w:type="gramStart"/>
             <w:r>
               <w:rPr>
                 <w:rFonts w:asciiTheme="majorHAnsi" w:eastAsiaTheme="majorHAnsi" w:hAnsiTheme="majorHAnsi" w:hint="eastAsia"/>
@@ -15113,16 +15120,7 @@
                 <w:sz w:val="20"/>
                 <w:szCs w:val="20"/>
               </w:rPr>
-              <w:t xml:space="preserve">  </w:t>
-            </w:r>
-            <w:proofErr w:type="gramEnd"/>
-            <w:r>
-              <w:rPr>
-                <w:rFonts w:asciiTheme="majorHAnsi" w:eastAsiaTheme="majorHAnsi" w:hAnsiTheme="majorHAnsi" w:hint="eastAsia"/>
-                <w:sz w:val="20"/>
-                <w:szCs w:val="20"/>
-              </w:rPr>
-              <w:t xml:space="preserve">  </w:t>
+              <w:t xml:space="preserve">    </w:t>
             </w:r>
             <w:sdt>
               <w:sdtPr>
@@ -15250,31 +15248,31 @@
                 </w:r>
               </w:sdtContent>
             </w:sdt>
-            <w:proofErr w:type="gramStart"/>
+            <w:proofErr w:type="spellStart"/>
             <w:r>
               <w:rPr>
                 <w:rFonts w:asciiTheme="majorHAnsi" w:eastAsiaTheme="majorHAnsi" w:hAnsiTheme="majorHAnsi" w:hint="eastAsia"/>
                 <w:sz w:val="20"/>
                 <w:szCs w:val="20"/>
               </w:rPr>
-              <w:t>완속충전기(</w:t>
-            </w:r>
+              <w:t>완속충전기</w:t>
+            </w:r>
+            <w:proofErr w:type="spellEnd"/>
             <w:r>
               <w:rPr>
                 <w:rFonts w:asciiTheme="majorHAnsi" w:eastAsiaTheme="majorHAnsi" w:hAnsiTheme="majorHAnsi" w:hint="eastAsia"/>
                 <w:sz w:val="20"/>
                 <w:szCs w:val="20"/>
               </w:rPr>
-              <w:t xml:space="preserve">  </w:t>
-            </w:r>
-            <w:proofErr w:type="gramEnd"/>
+              <w:t>(</w:t>
+            </w:r>
             <w:r>
               <w:rPr>
                 <w:rFonts w:asciiTheme="majorHAnsi" w:eastAsiaTheme="majorHAnsi" w:hAnsiTheme="majorHAnsi" w:hint="eastAsia"/>
                 <w:sz w:val="20"/>
                 <w:szCs w:val="20"/>
               </w:rPr>
-              <w:t xml:space="preserve">  </w:t>
+              <w:t xml:space="preserve">    </w:t>
             </w:r>
             <w:sdt>
               <w:sdtPr>
@@ -15459,33 +15457,15 @@
                 <w:sz w:val="20"/>
                 <w:szCs w:val="20"/>
               </w:rPr>
-              <w:t xml:space="preserve"> 전력분배형 </w:t>
-            </w:r>
-            <w:proofErr w:type="gramStart"/>
+              <w:t xml:space="preserve"> 전력분배형 충전기(</w:t>
+            </w:r>
             <w:r>
               <w:rPr>
                 <w:rFonts w:asciiTheme="majorHAnsi" w:eastAsiaTheme="majorHAnsi" w:hAnsiTheme="majorHAnsi" w:hint="eastAsia"/>
                 <w:sz w:val="20"/>
                 <w:szCs w:val="20"/>
               </w:rPr>
-              <w:t>충전기(</w:t>
-            </w:r>
-            <w:r>
-              <w:rPr>
-                <w:rFonts w:asciiTheme="majorHAnsi" w:eastAsiaTheme="majorHAnsi" w:hAnsiTheme="majorHAnsi" w:hint="eastAsia"/>
-                <w:sz w:val="20"/>
-                <w:szCs w:val="20"/>
-              </w:rPr>
-              <w:t xml:space="preserve">  </w:t>
-            </w:r>
-            <w:proofErr w:type="gramEnd"/>
-            <w:r>
-              <w:rPr>
-                <w:rFonts w:asciiTheme="majorHAnsi" w:eastAsiaTheme="majorHAnsi" w:hAnsiTheme="majorHAnsi" w:hint="eastAsia"/>
-                <w:sz w:val="20"/>
-                <w:szCs w:val="20"/>
-              </w:rPr>
-              <w:t xml:space="preserve">  </w:t>
+              <w:t xml:space="preserve">    </w:t>
             </w:r>
             <w:sdt>
               <w:sdtPr>
@@ -15612,31 +15592,31 @@
                 </w:r>
               </w:sdtContent>
             </w:sdt>
-            <w:proofErr w:type="gramStart"/>
+            <w:proofErr w:type="spellStart"/>
             <w:r>
               <w:rPr>
                 <w:rFonts w:asciiTheme="majorHAnsi" w:eastAsiaTheme="majorHAnsi" w:hAnsiTheme="majorHAnsi" w:hint="eastAsia"/>
                 <w:sz w:val="20"/>
                 <w:szCs w:val="20"/>
               </w:rPr>
-              <w:t>과금형콘센트(</w:t>
-            </w:r>
+              <w:t>과금형콘센트</w:t>
+            </w:r>
+            <w:proofErr w:type="spellEnd"/>
             <w:r>
               <w:rPr>
                 <w:rFonts w:asciiTheme="majorHAnsi" w:eastAsiaTheme="majorHAnsi" w:hAnsiTheme="majorHAnsi" w:hint="eastAsia"/>
                 <w:sz w:val="20"/>
                 <w:szCs w:val="20"/>
               </w:rPr>
-              <w:t xml:space="preserve">  </w:t>
-            </w:r>
-            <w:proofErr w:type="gramEnd"/>
+              <w:t>(</w:t>
+            </w:r>
             <w:r>
               <w:rPr>
                 <w:rFonts w:asciiTheme="majorHAnsi" w:eastAsiaTheme="majorHAnsi" w:hAnsiTheme="majorHAnsi" w:hint="eastAsia"/>
                 <w:sz w:val="20"/>
                 <w:szCs w:val="20"/>
               </w:rPr>
-              <w:t xml:space="preserve">  </w:t>
+              <w:t xml:space="preserve">    </w:t>
             </w:r>
             <w:sdt>
               <w:sdtPr>
@@ -15820,33 +15800,15 @@
                 <w:sz w:val="20"/>
                 <w:szCs w:val="20"/>
               </w:rPr>
-              <w:t xml:space="preserve"> </w:t>
-            </w:r>
-            <w:proofErr w:type="gramStart"/>
+              <w:t xml:space="preserve"> 키오스크(</w:t>
+            </w:r>
             <w:r>
               <w:rPr>
                 <w:rFonts w:asciiTheme="majorHAnsi" w:eastAsiaTheme="majorHAnsi" w:hAnsiTheme="majorHAnsi" w:hint="eastAsia"/>
                 <w:sz w:val="20"/>
                 <w:szCs w:val="20"/>
               </w:rPr>
-              <w:t>키오스크(</w:t>
-            </w:r>
-            <w:r>
-              <w:rPr>
-                <w:rFonts w:asciiTheme="majorHAnsi" w:eastAsiaTheme="majorHAnsi" w:hAnsiTheme="majorHAnsi" w:hint="eastAsia"/>
-                <w:sz w:val="20"/>
-                <w:szCs w:val="20"/>
-              </w:rPr>
-              <w:t xml:space="preserve">  </w:t>
-            </w:r>
-            <w:proofErr w:type="gramEnd"/>
-            <w:r>
-              <w:rPr>
-                <w:rFonts w:asciiTheme="majorHAnsi" w:eastAsiaTheme="majorHAnsi" w:hAnsiTheme="majorHAnsi" w:hint="eastAsia"/>
-                <w:sz w:val="20"/>
-                <w:szCs w:val="20"/>
-              </w:rPr>
-              <w:t xml:space="preserve">      </w:t>
+              <w:t xml:space="preserve">        </w:t>
             </w:r>
             <w:r>
               <w:rPr>
@@ -23165,15 +23127,15 @@
 <w:fonts xmlns:mc="http://schemas.openxmlformats.org/markup-compatibility/2006" xmlns:r="http://schemas.openxmlformats.org/officeDocument/2006/relationships" xmlns:w="http://schemas.openxmlformats.org/wordprocessingml/2006/main" xmlns:w14="http://schemas.microsoft.com/office/word/2010/wordml" xmlns:w15="http://schemas.microsoft.com/office/word/2012/wordml" xmlns:w16cex="http://schemas.microsoft.com/office/word/2018/wordml/cex" xmlns:w16cid="http://schemas.microsoft.com/office/word/2016/wordml/cid" xmlns:w16="http://schemas.microsoft.com/office/word/2018/wordml" xmlns:w16du="http://schemas.microsoft.com/office/word/2023/wordml/word16du" xmlns:w16sdtdh="http://schemas.microsoft.com/office/word/2020/wordml/sdtdatahash" xmlns:w16sdtfl="http://schemas.microsoft.com/office/word/2024/wordml/sdtformatlock" xmlns:w16se="http://schemas.microsoft.com/office/word/2015/wordml/symex" mc:Ignorable="w14 w15 w16se w16cid w16 w16cex w16sdtdh w16sdtfl w16du">
   <w:font w:name="Wingdings">
     <w:panose1 w:val="05000000000000000000"/>
-    <w:charset w:val="02"/>
-    <w:family w:val="auto"/>
+    <w:charset w:val="00"/>
+    <w:family w:val="decorative"/>
     <w:pitch w:val="variable"/>
-    <w:sig w:usb0="00000000" w:usb1="10000000" w:usb2="00000000" w:usb3="00000000" w:csb0="80000000" w:csb1="00000000"/>
+    <w:sig w:usb0="00000003" w:usb1="00000000" w:usb2="00000000" w:usb3="00000000" w:csb0="80000001" w:csb1="00000000"/>
   </w:font>
   <w:font w:name="맑은 고딕">
     <w:panose1 w:val="020B0503020000020004"/>
     <w:charset w:val="81"/>
-    <w:family w:val="modern"/>
+    <w:family w:val="swiss"/>
     <w:pitch w:val="variable"/>
     <w:sig w:usb0="9000002F" w:usb1="29D77CFB" w:usb2="00000012" w:usb3="00000000" w:csb0="00080001" w:csb1="00000000"/>
   </w:font>
@@ -23194,7 +23156,7 @@
   </w:font>
   <w:font w:name="Noto Sans KR">
     <w:altName w:val="맑은 고딕"/>
-    <w:panose1 w:val="020B0200000000000000"/>
+    <w:panose1 w:val="020B0604020202020204"/>
     <w:charset w:val="81"/>
     <w:family w:val="modern"/>
     <w:pitch w:val="variable"/>
@@ -23230,11 +23192,15 @@
   </w:compat>
   <w:rsids>
     <w:rsidRoot w:val="0096585E"/>
+    <w:rsid w:val="00042483"/>
+    <w:rsid w:val="00101DAD"/>
     <w:rsid w:val="00402174"/>
     <w:rsid w:val="004F2437"/>
     <w:rsid w:val="006741E6"/>
     <w:rsid w:val="008D2505"/>
     <w:rsid w:val="0096585E"/>
+    <w:rsid w:val="009D18C7"/>
+    <w:rsid w:val="00D27F0F"/>
   </w:rsids>
   <m:mathPr>
     <m:mathFont m:val="Cambria Math"/>

</xml_diff>

<commit_message>
Fix pluglink blank page (행위신고 업무대행 동의서 trailing empty paragraph)
User-edited template: removed the extra empty paragraph that pushed a
blank page after the 행위신고 업무대행 동의서 section. Verified: valid docx,
별지5호/7호 span-consistent, 별지5호 fill intact (7~11kW fills, 11~30kW blank),
renders to 7 pages with no blank page.

Co-Authored-By: Claude Opus 4.8 (1M context) <noreply@anthropic.com>
</commit_message>
<xml_diff>
--- a/public/pluglink/template.docx
+++ b/public/pluglink/template.docx
@@ -6365,31 +6365,23 @@
       <w:pPr>
         <w:jc w:val="center"/>
         <w:rPr>
-          <w:b/>
-          <w:bCs/>
-          <w:sz w:val="28"/>
-          <w:szCs w:val="28"/>
-        </w:rPr>
-      </w:pPr>
-      <w:r>
-        <w:rPr>
           <w:rFonts w:hint="eastAsia"/>
           <w:b/>
           <w:bCs/>
           <w:sz w:val="28"/>
           <w:szCs w:val="28"/>
         </w:rPr>
+      </w:pPr>
+      <w:r>
+        <w:rPr>
+          <w:rFonts w:hint="eastAsia"/>
+          <w:b/>
+          <w:bCs/>
+          <w:sz w:val="28"/>
+          <w:szCs w:val="28"/>
+        </w:rPr>
         <w:t>주식회사 플러그링크 귀중</w:t>
       </w:r>
-    </w:p>
-    <w:p>
-      <w:pPr>
-        <w:jc w:val="both"/>
-        <w:rPr>
-          <w:sz w:val="28"/>
-          <w:szCs w:val="28"/>
-        </w:rPr>
-      </w:pPr>
     </w:p>
     <w:p>
       <w:pPr>
@@ -6586,11 +6578,8 @@
         <w:gridCol w:w="1000"/>
         <w:gridCol w:w="1552"/>
         <w:gridCol w:w="1843"/>
-        <w:gridCol w:w="601"/>
-        <w:gridCol w:w="1039"/>
-        <w:gridCol w:w="61"/>
-        <w:gridCol w:w="1344"/>
-        <w:gridCol w:w="519"/>
+        <w:gridCol w:w="1701"/>
+        <w:gridCol w:w="1863"/>
         <w:gridCol w:w="1539"/>
         <w:gridCol w:w="386"/>
         <w:gridCol w:w="10"/>
@@ -6632,7 +6621,7 @@
         <w:tc>
           <w:tcPr>
             <w:tcW w:w="5096" w:type="dxa"/>
-            <w:gridSpan w:val="5"/>
+            <w:gridSpan w:val="3"/>
             <w:vAlign w:val="center"/>
           </w:tcPr>
           <w:p>
@@ -6684,7 +6673,6 @@
         <w:tc>
           <w:tcPr>
             <w:tcW w:w="1863" w:type="dxa"/>
-            <w:gridSpan w:val="2"/>
             <w:vAlign w:val="center"/>
           </w:tcPr>
           <w:p>
@@ -6824,7 +6812,7 @@
         <w:tc>
           <w:tcPr>
             <w:tcW w:w="8884" w:type="dxa"/>
-            <w:gridSpan w:val="9"/>
+            <w:gridSpan w:val="6"/>
             <w:vAlign w:val="center"/>
           </w:tcPr>
           <w:p>
@@ -7047,7 +7035,7 @@
         <w:tc>
           <w:tcPr>
             <w:tcW w:w="8884" w:type="dxa"/>
-            <w:gridSpan w:val="9"/>
+            <w:gridSpan w:val="6"/>
             <w:vAlign w:val="center"/>
           </w:tcPr>
           <w:p>
@@ -7391,7 +7379,6 @@
             <w:tc>
               <w:tcPr>
                 <w:tcW w:w="1701" w:type="dxa"/>
-                <w:gridSpan w:val="3"/>
                 <w:vAlign w:val="center"/>
               </w:tcPr>
               <w:p>
@@ -7424,7 +7411,6 @@
         <w:tc>
           <w:tcPr>
             <w:tcW w:w="1863" w:type="dxa"/>
-            <w:gridSpan w:val="2"/>
             <w:vAlign w:val="center"/>
           </w:tcPr>
           <w:p>
@@ -7610,7 +7596,6 @@
         <w:tc>
           <w:tcPr>
             <w:tcW w:w="1701" w:type="dxa"/>
-            <w:gridSpan w:val="3"/>
             <w:vAlign w:val="center"/>
           </w:tcPr>
           <w:p>
@@ -7634,7 +7619,6 @@
         <w:tc>
           <w:tcPr>
             <w:tcW w:w="1863" w:type="dxa"/>
-            <w:gridSpan w:val="2"/>
             <w:vAlign w:val="center"/>
           </w:tcPr>
           <w:p>
@@ -7770,7 +7754,6 @@
             <w:tc>
               <w:tcPr>
                 <w:tcW w:w="1701" w:type="dxa"/>
-                <w:gridSpan w:val="3"/>
                 <w:vAlign w:val="center"/>
               </w:tcPr>
               <w:p>
@@ -7838,7 +7821,6 @@
             <w:tc>
               <w:tcPr>
                 <w:tcW w:w="1863" w:type="dxa"/>
-                <w:gridSpan w:val="2"/>
                 <w:vAlign w:val="center"/>
               </w:tcPr>
               <w:p>
@@ -8002,7 +7984,6 @@
         <w:tc>
           <w:tcPr>
             <w:tcW w:w="1701" w:type="dxa"/>
-            <w:gridSpan w:val="3"/>
             <w:vAlign w:val="center"/>
           </w:tcPr>
           <w:p>
@@ -8019,14 +8000,14 @@
                 <w:sz w:val="18"/>
                 <w:szCs w:val="18"/>
               </w:rPr>
-              <w:t xml:space="preserve">활동내용</w:t>
+              <w:t>활동내용</w:t>
             </w:r>
           </w:p>
         </w:tc>
         <w:tc>
           <w:tcPr>
             <w:tcW w:w="1863" w:type="dxa"/>
-            <w:gridSpan w:val="4"/>
+            <w:gridSpan w:val="3"/>
             <w:vAlign w:val="center"/>
           </w:tcPr>
           <w:p>
@@ -8042,21 +8023,6 @@
                 <w:u w:val="single"/>
               </w:rPr>
             </w:pPr>
-            <w:r>
-              <w:rPr>
-                <w:rStyle w:val="af0"/>
-                <w:rFonts w:hint="eastAsia"/>
-                <w:b/>
-                <w:bCs/>
-                <w:i/>
-                <w:iCs/>
-                <w:color w:val="A6A6A6" w:themeColor="background1" w:themeShade="A6"/>
-                <w:sz w:val="18"/>
-                <w:szCs w:val="18"/>
-                <w:u w:val="single"/>
-              </w:rPr>
-              <w:t xml:space="preserve"/>
-            </w:r>
           </w:p>
         </w:tc>
       </w:tr>
@@ -8104,7 +8070,7 @@
         <w:tc>
           <w:tcPr>
             <w:tcW w:w="7332" w:type="dxa"/>
-            <w:gridSpan w:val="8"/>
+            <w:gridSpan w:val="5"/>
             <w:vAlign w:val="center"/>
           </w:tcPr>
           <w:p>
@@ -8204,7 +8170,7 @@
         <w:tc>
           <w:tcPr>
             <w:tcW w:w="6959" w:type="dxa"/>
-            <w:gridSpan w:val="7"/>
+            <w:gridSpan w:val="4"/>
             <w:vAlign w:val="center"/>
           </w:tcPr>
           <w:p>
@@ -8377,7 +8343,7 @@
         <w:tc>
           <w:tcPr>
             <w:tcW w:w="6959" w:type="dxa"/>
-            <w:gridSpan w:val="7"/>
+            <w:gridSpan w:val="4"/>
             <w:vAlign w:val="center"/>
           </w:tcPr>
           <w:p>
@@ -8613,7 +8579,7 @@
         <w:tc>
           <w:tcPr>
             <w:tcW w:w="6959" w:type="dxa"/>
-            <w:gridSpan w:val="7"/>
+            <w:gridSpan w:val="4"/>
             <w:vAlign w:val="center"/>
           </w:tcPr>
           <w:p>
@@ -8831,7 +8797,7 @@
         <w:tc>
           <w:tcPr>
             <w:tcW w:w="1924" w:type="dxa"/>
-            <w:gridSpan w:val="5"/>
+            <w:gridSpan w:val="2"/>
             <w:vAlign w:val="center"/>
           </w:tcPr>
           <w:p>
@@ -8849,7 +8815,7 @@
                 <w:sz w:val="18"/>
                 <w:szCs w:val="18"/>
               </w:rPr>
-              <w:t xml:space="preserve">7kW 이상 ~ 11kW 미만</w:t>
+              <w:t>7kW 이상 ~ 11kW 미만</w:t>
             </w:r>
           </w:p>
         </w:tc>
@@ -8982,7 +8948,7 @@
         <w:tc>
           <w:tcPr>
             <w:tcW w:w="1924" w:type="dxa"/>
-            <w:gridSpan w:val="5"/>
+            <w:gridSpan w:val="2"/>
             <w:vAlign w:val="center"/>
           </w:tcPr>
           <w:p>
@@ -9000,7 +8966,7 @@
                 <w:sz w:val="18"/>
                 <w:szCs w:val="18"/>
               </w:rPr>
-              <w:t xml:space="preserve">11kW 이상 ~ 30kW 미만</w:t>
+              <w:t>11kW 이상 ~ 30kW 미만</w:t>
             </w:r>
           </w:p>
         </w:tc>
@@ -9072,7 +9038,7 @@
         <w:tc>
           <w:tcPr>
             <w:tcW w:w="1924" w:type="dxa"/>
-            <w:gridSpan w:val="5"/>
+            <w:gridSpan w:val="2"/>
             <w:vAlign w:val="center"/>
           </w:tcPr>
           <w:p>
@@ -9090,7 +9056,7 @@
                 <w:sz w:val="18"/>
                 <w:szCs w:val="18"/>
               </w:rPr>
-              <w:t xml:space="preserve">전력분배형</w:t>
+              <w:t>전력분배형</w:t>
             </w:r>
           </w:p>
         </w:tc>
@@ -9234,7 +9200,7 @@
         <w:tc>
           <w:tcPr>
             <w:tcW w:w="7332" w:type="dxa"/>
-            <w:gridSpan w:val="8"/>
+            <w:gridSpan w:val="5"/>
             <w:vAlign w:val="center"/>
           </w:tcPr>
           <w:p>
@@ -9337,7 +9303,7 @@
         <w:tc>
           <w:tcPr>
             <w:tcW w:w="7332" w:type="dxa"/>
-            <w:gridSpan w:val="8"/>
+            <w:gridSpan w:val="5"/>
             <w:vAlign w:val="center"/>
           </w:tcPr>
           <w:p>
@@ -9362,7 +9328,7 @@
         <w:tc>
           <w:tcPr>
             <w:tcW w:w="10436" w:type="dxa"/>
-            <w:gridSpan w:val="11"/>
+            <w:gridSpan w:val="8"/>
           </w:tcPr>
           <w:p>
             <w:pPr>
@@ -9483,8 +9449,8 @@
                 </w:r>
               </w:sdtContent>
             </w:sdt>
-            <w:bookmarkStart w:id="34" w:name="ContMonth4"/>
-            <w:bookmarkEnd w:id="34"/>
+            <w:bookmarkStart w:id="33" w:name="ContMonth4"/>
+            <w:bookmarkEnd w:id="33"/>
             <w:r>
               <w:rPr>
                 <w:sz w:val="24"/>
@@ -9535,8 +9501,8 @@
                 </w:r>
               </w:sdtContent>
             </w:sdt>
-            <w:bookmarkStart w:id="35" w:name="ContDay4"/>
-            <w:bookmarkEnd w:id="35"/>
+            <w:bookmarkStart w:id="34" w:name="ContDay4"/>
+            <w:bookmarkEnd w:id="34"/>
             <w:r>
               <w:rPr>
                 <w:sz w:val="24"/>
@@ -9573,8 +9539,8 @@
               </w:rPr>
               <w:t xml:space="preserve">: </w:t>
             </w:r>
-            <w:bookmarkStart w:id="36" w:name="CustName5"/>
-            <w:bookmarkEnd w:id="36"/>
+            <w:bookmarkStart w:id="35" w:name="CustName5"/>
+            <w:bookmarkEnd w:id="35"/>
             <w:sdt>
               <w:sdtPr>
                 <w:rPr>
@@ -9638,7 +9604,8 @@
             <w:pPr>
               <w:jc w:val="both"/>
               <w:rPr>
-                <w:sz w:val="24"/>
+                <w:sz w:val="28"/>
+                <w:szCs w:val="28"/>
               </w:rPr>
             </w:pPr>
             <w:r>
@@ -9667,6 +9634,15 @@
               </w:rPr>
               <w:t>귀하</w:t>
             </w:r>
+          </w:p>
+          <w:p>
+            <w:pPr>
+              <w:jc w:val="both"/>
+              <w:rPr>
+                <w:rFonts w:hint="eastAsia"/>
+                <w:sz w:val="24"/>
+              </w:rPr>
+            </w:pPr>
           </w:p>
         </w:tc>
       </w:tr>
@@ -9704,7 +9680,7 @@
         <w:tc>
           <w:tcPr>
             <w:tcW w:w="9498" w:type="dxa"/>
-            <w:gridSpan w:val="9"/>
+            <w:gridSpan w:val="6"/>
             <w:tcBorders>
               <w:top w:val="single" w:sz="12" w:space="0" w:color="auto"/>
               <w:left w:val="nil"/>
@@ -10028,7 +10004,7 @@
         <w:tc>
           <w:tcPr>
             <w:tcW w:w="9498" w:type="dxa"/>
-            <w:gridSpan w:val="9"/>
+            <w:gridSpan w:val="6"/>
             <w:tcBorders>
               <w:left w:val="single" w:sz="4" w:space="0" w:color="auto"/>
               <w:bottom w:val="single" w:sz="4" w:space="0" w:color="auto"/>
@@ -10395,7 +10371,7 @@
         <w:tc>
           <w:tcPr>
             <w:tcW w:w="9498" w:type="dxa"/>
-            <w:gridSpan w:val="9"/>
+            <w:gridSpan w:val="6"/>
             <w:tcBorders>
               <w:left w:val="nil"/>
               <w:right w:val="nil"/>
@@ -10502,7 +10478,7 @@
         <w:tc>
           <w:tcPr>
             <w:tcW w:w="9498" w:type="dxa"/>
-            <w:gridSpan w:val="9"/>
+            <w:gridSpan w:val="6"/>
             <w:tcBorders>
               <w:left w:val="single" w:sz="4" w:space="0" w:color="auto"/>
               <w:right w:val="single" w:sz="4" w:space="0" w:color="auto"/>
@@ -10947,7 +10923,7 @@
         <w:tc>
           <w:tcPr>
             <w:tcW w:w="9498" w:type="dxa"/>
-            <w:gridSpan w:val="9"/>
+            <w:gridSpan w:val="6"/>
             <w:tcBorders>
               <w:left w:val="nil"/>
               <w:bottom w:val="single" w:sz="12" w:space="0" w:color="auto"/>
@@ -11053,8 +11029,8 @@
               </w:rPr>
               <w:t xml:space="preserve">2026년 </w:t>
             </w:r>
-            <w:bookmarkStart w:id="37" w:name="ContMonth5"/>
-            <w:bookmarkEnd w:id="37"/>
+            <w:bookmarkStart w:id="36" w:name="ContMonth5"/>
+            <w:bookmarkEnd w:id="36"/>
             <w:sdt>
               <w:sdtPr>
                 <w:rPr>
@@ -11109,8 +11085,8 @@
               </w:rPr>
               <w:t xml:space="preserve">월 </w:t>
             </w:r>
-            <w:bookmarkStart w:id="38" w:name="ContDay5"/>
-            <w:bookmarkEnd w:id="38"/>
+            <w:bookmarkStart w:id="37" w:name="ContDay5"/>
+            <w:bookmarkEnd w:id="37"/>
             <w:sdt>
               <w:sdtPr>
                 <w:rPr>
@@ -11203,8 +11179,8 @@
               </w:rPr>
               <w:t xml:space="preserve">신 청 자 : </w:t>
             </w:r>
-            <w:bookmarkStart w:id="39" w:name="CustName7"/>
-            <w:bookmarkEnd w:id="39"/>
+            <w:bookmarkStart w:id="38" w:name="CustName7"/>
+            <w:bookmarkEnd w:id="38"/>
             <w:sdt>
               <w:sdtPr>
                 <w:rPr>
@@ -11317,6 +11293,16 @@
       <w:pPr>
         <w:jc w:val="both"/>
         <w:rPr>
+          <w:rFonts w:hint="eastAsia"/>
+          <w:sz w:val="18"/>
+          <w:szCs w:val="18"/>
+        </w:rPr>
+      </w:pPr>
+    </w:p>
+    <w:p>
+      <w:pPr>
+        <w:jc w:val="both"/>
+        <w:rPr>
           <w:sz w:val="28"/>
           <w:szCs w:val="28"/>
         </w:rPr>
@@ -11375,15 +11361,15 @@
         <w:tblLook w:val="04A0" w:firstRow="1" w:lastRow="0" w:firstColumn="1" w:lastColumn="0" w:noHBand="0" w:noVBand="1"/>
       </w:tblPr>
       <w:tblGrid>
-        <w:gridCol w:w="279"/>
-        <w:gridCol w:w="1639"/>
+        <w:gridCol w:w="278"/>
         <w:gridCol w:w="1638"/>
         <w:gridCol w:w="1638"/>
-        <w:gridCol w:w="816"/>
-        <w:gridCol w:w="822"/>
+        <w:gridCol w:w="1643"/>
+        <w:gridCol w:w="812"/>
+        <w:gridCol w:w="827"/>
         <w:gridCol w:w="1638"/>
         <w:gridCol w:w="1638"/>
-        <w:gridCol w:w="328"/>
+        <w:gridCol w:w="324"/>
       </w:tblGrid>
       <w:tr>
         <w:trPr>
@@ -11461,8 +11447,8 @@
             </w:r>
           </w:p>
         </w:tc>
-        <w:bookmarkStart w:id="40" w:name="CustName6"/>
-        <w:bookmarkEnd w:id="40"/>
+        <w:bookmarkStart w:id="39" w:name="CustName6"/>
+        <w:bookmarkEnd w:id="39"/>
         <w:tc>
           <w:tcPr>
             <w:tcW w:w="1570" w:type="pct"/>
@@ -11540,8 +11526,8 @@
             </w:r>
           </w:p>
         </w:tc>
-        <w:bookmarkStart w:id="41" w:name="CustTel3" w:displacedByCustomXml="next"/>
-        <w:bookmarkEnd w:id="41" w:displacedByCustomXml="next"/>
+        <w:bookmarkStart w:id="40" w:name="CustTel3" w:displacedByCustomXml="next"/>
+        <w:bookmarkEnd w:id="40" w:displacedByCustomXml="next"/>
         <w:sdt>
           <w:sdtPr>
             <w:rPr>
@@ -11637,8 +11623,8 @@
             </w:r>
           </w:p>
         </w:tc>
-        <w:bookmarkStart w:id="42" w:name="CustAddr3" w:displacedByCustomXml="next"/>
-        <w:bookmarkEnd w:id="42" w:displacedByCustomXml="next"/>
+        <w:bookmarkStart w:id="41" w:name="CustAddr3" w:displacedByCustomXml="next"/>
+        <w:bookmarkEnd w:id="41" w:displacedByCustomXml="next"/>
         <w:sdt>
           <w:sdtPr>
             <w:rPr>
@@ -11779,14 +11765,32 @@
             <w:pPr>
               <w:jc w:val="center"/>
               <w:rPr>
+                <w:rFonts w:asciiTheme="majorHAnsi" w:eastAsiaTheme="majorHAnsi" w:hAnsiTheme="majorHAnsi"/>
+              </w:rPr>
+            </w:pPr>
+            <w:r>
+              <w:rPr>
                 <w:rFonts w:asciiTheme="majorHAnsi" w:eastAsiaTheme="majorHAnsi" w:hAnsiTheme="majorHAnsi" w:hint="eastAsia"/>
               </w:rPr>
-            </w:pPr>
+              <w:t xml:space="preserve">7kW </w:t>
+            </w:r>
             <w:r>
               <w:rPr>
                 <w:rFonts w:asciiTheme="majorHAnsi" w:eastAsiaTheme="majorHAnsi" w:hAnsiTheme="majorHAnsi" w:hint="eastAsia"/>
               </w:rPr>
-              <w:t>7kW 이상 ~ 11kW 미만</w:t>
+              <w:t>이상</w:t>
+            </w:r>
+            <w:r>
+              <w:rPr>
+                <w:rFonts w:asciiTheme="majorHAnsi" w:eastAsiaTheme="majorHAnsi" w:hAnsiTheme="majorHAnsi" w:hint="eastAsia"/>
+              </w:rPr>
+              <w:t xml:space="preserve"> ~ 11kW </w:t>
+            </w:r>
+            <w:r>
+              <w:rPr>
+                <w:rFonts w:asciiTheme="majorHAnsi" w:eastAsiaTheme="majorHAnsi" w:hAnsiTheme="majorHAnsi" w:hint="eastAsia"/>
+              </w:rPr>
+              <w:t>미만</w:t>
             </w:r>
           </w:p>
         </w:tc>
@@ -11824,9 +11828,6 @@
                   <w:rFonts w:hint="eastAsia"/>
                 </w:rPr>
                 <w:id w:val="-1335375053"/>
-                <w:placeholder>
-                  <w:docPart w:val="1CAD5D37B74AA74D9D39C4ED7B27E881"/>
-                </w:placeholder>
                 <w:showingPlcHdr/>
                 <w:text/>
               </w:sdtPr>
@@ -11839,6 +11840,7 @@
                   <w:i/>
                   <w:iCs/>
                   <w:color w:val="A6A6A6" w:themeColor="background1" w:themeShade="A6"/>
+                  <w:sz w:val="22"/>
                   <w:u w:val="single"/>
                 </w:rPr>
               </w:sdtEndPr>
@@ -11852,7 +11854,6 @@
                     <w:i/>
                     <w:iCs/>
                     <w:color w:val="A6A6A6" w:themeColor="background1" w:themeShade="A6"/>
-                    <w:u w:val="single"/>
                   </w:rPr>
                   <w:t xml:space="preserve">OO </w:t>
                 </w:r>
@@ -11868,7 +11869,13 @@
               <w:rPr>
                 <w:rFonts w:asciiTheme="majorHAnsi" w:eastAsiaTheme="majorHAnsi" w:hAnsiTheme="majorHAnsi"/>
               </w:rPr>
-              <w:t>)기</w:t>
+              <w:t>)</w:t>
+            </w:r>
+            <w:r>
+              <w:rPr>
+                <w:rFonts w:asciiTheme="majorHAnsi" w:eastAsiaTheme="majorHAnsi" w:hAnsiTheme="majorHAnsi"/>
+              </w:rPr>
+              <w:t>기</w:t>
             </w:r>
           </w:p>
         </w:tc>
@@ -11889,14 +11896,32 @@
             <w:pPr>
               <w:jc w:val="center"/>
               <w:rPr>
+                <w:rFonts w:asciiTheme="majorHAnsi" w:eastAsiaTheme="majorHAnsi" w:hAnsiTheme="majorHAnsi"/>
+              </w:rPr>
+            </w:pPr>
+            <w:r>
+              <w:rPr>
                 <w:rFonts w:asciiTheme="majorHAnsi" w:eastAsiaTheme="majorHAnsi" w:hAnsiTheme="majorHAnsi" w:hint="eastAsia"/>
               </w:rPr>
-            </w:pPr>
+              <w:t xml:space="preserve">11kW </w:t>
+            </w:r>
             <w:r>
               <w:rPr>
                 <w:rFonts w:asciiTheme="majorHAnsi" w:eastAsiaTheme="majorHAnsi" w:hAnsiTheme="majorHAnsi" w:hint="eastAsia"/>
               </w:rPr>
-              <w:t>11kW 이상 ~ 30kW 미만</w:t>
+              <w:t>이상</w:t>
+            </w:r>
+            <w:r>
+              <w:rPr>
+                <w:rFonts w:asciiTheme="majorHAnsi" w:eastAsiaTheme="majorHAnsi" w:hAnsiTheme="majorHAnsi" w:hint="eastAsia"/>
+              </w:rPr>
+              <w:t xml:space="preserve"> ~ 30kW </w:t>
+            </w:r>
+            <w:r>
+              <w:rPr>
+                <w:rFonts w:asciiTheme="majorHAnsi" w:eastAsiaTheme="majorHAnsi" w:hAnsiTheme="majorHAnsi" w:hint="eastAsia"/>
+              </w:rPr>
+              <w:t>미만</w:t>
             </w:r>
           </w:p>
         </w:tc>
@@ -11934,9 +11959,6 @@
                   <w:rFonts w:hint="eastAsia"/>
                 </w:rPr>
                 <w:id w:val="313466420"/>
-                <w:placeholder>
-                  <w:docPart w:val="ED93C1928DBA2B4AB78D22611A942B6D"/>
-                </w:placeholder>
                 <w:showingPlcHdr/>
                 <w:text/>
               </w:sdtPr>
@@ -11949,6 +11971,7 @@
                   <w:i/>
                   <w:iCs/>
                   <w:color w:val="A6A6A6" w:themeColor="background1" w:themeShade="A6"/>
+                  <w:sz w:val="22"/>
                   <w:u w:val="single"/>
                 </w:rPr>
               </w:sdtEndPr>
@@ -11962,7 +11985,6 @@
                     <w:i/>
                     <w:iCs/>
                     <w:color w:val="A6A6A6" w:themeColor="background1" w:themeShade="A6"/>
-                    <w:u w:val="single"/>
                   </w:rPr>
                   <w:t xml:space="preserve">OO </w:t>
                 </w:r>
@@ -11978,7 +12000,13 @@
               <w:rPr>
                 <w:rFonts w:asciiTheme="majorHAnsi" w:eastAsiaTheme="majorHAnsi" w:hAnsiTheme="majorHAnsi"/>
               </w:rPr>
-              <w:t>)기</w:t>
+              <w:t>)</w:t>
+            </w:r>
+            <w:r>
+              <w:rPr>
+                <w:rFonts w:asciiTheme="majorHAnsi" w:eastAsiaTheme="majorHAnsi" w:hAnsiTheme="majorHAnsi"/>
+              </w:rPr>
+              <w:t>기</w:t>
             </w:r>
           </w:p>
         </w:tc>
@@ -11999,14 +12027,26 @@
             <w:pPr>
               <w:jc w:val="center"/>
               <w:rPr>
+                <w:rFonts w:asciiTheme="majorHAnsi" w:eastAsiaTheme="majorHAnsi" w:hAnsiTheme="majorHAnsi"/>
+              </w:rPr>
+            </w:pPr>
+            <w:r>
+              <w:rPr>
                 <w:rFonts w:asciiTheme="majorHAnsi" w:eastAsiaTheme="majorHAnsi" w:hAnsiTheme="majorHAnsi" w:hint="eastAsia"/>
               </w:rPr>
-            </w:pPr>
+              <w:t>전력분배형</w:t>
+            </w:r>
             <w:r>
               <w:rPr>
                 <w:rFonts w:asciiTheme="majorHAnsi" w:eastAsiaTheme="majorHAnsi" w:hAnsiTheme="majorHAnsi" w:hint="eastAsia"/>
               </w:rPr>
-              <w:t>전력분배형 충전기</w:t>
+              <w:t xml:space="preserve"> </w:t>
+            </w:r>
+            <w:r>
+              <w:rPr>
+                <w:rFonts w:asciiTheme="majorHAnsi" w:eastAsiaTheme="majorHAnsi" w:hAnsiTheme="majorHAnsi" w:hint="eastAsia"/>
+              </w:rPr>
+              <w:t>충전기</w:t>
             </w:r>
           </w:p>
         </w:tc>
@@ -12022,14 +12062,44 @@
             <w:pPr>
               <w:jc w:val="center"/>
               <w:rPr>
-                <w:rFonts w:asciiTheme="majorHAnsi" w:eastAsiaTheme="majorHAnsi" w:hAnsiTheme="majorHAnsi" w:hint="eastAsia"/>
-              </w:rPr>
-            </w:pPr>
-            <w:r>
-              <w:rPr>
                 <w:rFonts w:asciiTheme="majorHAnsi" w:eastAsiaTheme="majorHAnsi" w:hAnsiTheme="majorHAnsi"/>
               </w:rPr>
-              <w:t>(    )kW  (    )기  케이블 (    )개</w:t>
+            </w:pPr>
+            <w:r>
+              <w:rPr>
+                <w:rFonts w:asciiTheme="majorHAnsi" w:eastAsiaTheme="majorHAnsi" w:hAnsiTheme="majorHAnsi"/>
+              </w:rPr>
+              <w:t>(    )kW  (    )</w:t>
+            </w:r>
+            <w:r>
+              <w:rPr>
+                <w:rFonts w:asciiTheme="majorHAnsi" w:eastAsiaTheme="majorHAnsi" w:hAnsiTheme="majorHAnsi"/>
+              </w:rPr>
+              <w:t>기</w:t>
+            </w:r>
+            <w:r>
+              <w:rPr>
+                <w:rFonts w:asciiTheme="majorHAnsi" w:eastAsiaTheme="majorHAnsi" w:hAnsiTheme="majorHAnsi"/>
+              </w:rPr>
+              <w:t xml:space="preserve">  </w:t>
+            </w:r>
+            <w:r>
+              <w:rPr>
+                <w:rFonts w:asciiTheme="majorHAnsi" w:eastAsiaTheme="majorHAnsi" w:hAnsiTheme="majorHAnsi"/>
+              </w:rPr>
+              <w:t>케이블</w:t>
+            </w:r>
+            <w:r>
+              <w:rPr>
+                <w:rFonts w:asciiTheme="majorHAnsi" w:eastAsiaTheme="majorHAnsi" w:hAnsiTheme="majorHAnsi"/>
+              </w:rPr>
+              <w:t xml:space="preserve"> (    )</w:t>
+            </w:r>
+            <w:r>
+              <w:rPr>
+                <w:rFonts w:asciiTheme="majorHAnsi" w:eastAsiaTheme="majorHAnsi" w:hAnsiTheme="majorHAnsi"/>
+              </w:rPr>
+              <w:t>개</w:t>
             </w:r>
           </w:p>
         </w:tc>
@@ -12098,8 +12168,8 @@
             </w:r>
           </w:p>
         </w:tc>
-        <w:bookmarkStart w:id="43" w:name="Parkinglot2"/>
-        <w:bookmarkEnd w:id="43"/>
+        <w:bookmarkStart w:id="42" w:name="Parkinglot2"/>
+        <w:bookmarkEnd w:id="42"/>
         <w:tc>
           <w:tcPr>
             <w:tcW w:w="785" w:type="pct"/>
@@ -12468,8 +12538,8 @@
               </w:rPr>
               <w:t xml:space="preserve"> 기타 ( </w:t>
             </w:r>
-            <w:bookmarkStart w:id="44" w:name="Type33txt"/>
-            <w:bookmarkEnd w:id="44"/>
+            <w:bookmarkStart w:id="43" w:name="Type33txt"/>
+            <w:bookmarkEnd w:id="43"/>
             <w:sdt>
               <w:sdtPr>
                 <w:rPr>
@@ -12612,8 +12682,8 @@
             </w:r>
           </w:p>
         </w:tc>
-        <w:bookmarkStart w:id="45" w:name="InstallAddr3" w:displacedByCustomXml="next"/>
-        <w:bookmarkEnd w:id="45" w:displacedByCustomXml="next"/>
+        <w:bookmarkStart w:id="44" w:name="InstallAddr3" w:displacedByCustomXml="next"/>
+        <w:bookmarkEnd w:id="44" w:displacedByCustomXml="next"/>
         <w:sdt>
           <w:sdtPr>
             <w:rPr>
@@ -14778,16 +14848,6 @@
               </w:rPr>
               <w:t>6. 중복설치 여부</w:t>
             </w:r>
-            <w:r>
-              <w:rPr>
-                <w:rFonts w:asciiTheme="majorHAnsi" w:eastAsiaTheme="majorHAnsi" w:hAnsiTheme="majorHAnsi"/>
-                <w:b/>
-                <w:bCs/>
-                <w:sz w:val="20"/>
-                <w:szCs w:val="20"/>
-              </w:rPr>
-              <w:t/>
-            </w:r>
           </w:p>
         </w:tc>
       </w:tr>
@@ -14987,8 +15047,8 @@
               </w:rPr>
               <w:t xml:space="preserve"> </w:t>
             </w:r>
-            <w:bookmarkStart w:id="46" w:name="FastQty"/>
-            <w:bookmarkEnd w:id="46"/>
+            <w:bookmarkStart w:id="45" w:name="FastQty"/>
+            <w:bookmarkEnd w:id="45"/>
             <w:r>
               <w:rPr>
                 <w:rFonts w:asciiTheme="majorHAnsi" w:eastAsiaTheme="majorHAnsi" w:hAnsiTheme="majorHAnsi"/>
@@ -15139,8 +15199,8 @@
               </w:rPr>
               <w:t xml:space="preserve"> </w:t>
             </w:r>
-            <w:bookmarkStart w:id="47" w:name="SlowQty"/>
-            <w:bookmarkEnd w:id="47"/>
+            <w:bookmarkStart w:id="46" w:name="SlowQty"/>
+            <w:bookmarkEnd w:id="46"/>
             <w:r>
               <w:rPr>
                 <w:rFonts w:asciiTheme="majorHAnsi" w:eastAsiaTheme="majorHAnsi" w:hAnsiTheme="majorHAnsi"/>
@@ -15483,8 +15543,8 @@
               </w:rPr>
               <w:t xml:space="preserve"> </w:t>
             </w:r>
-            <w:bookmarkStart w:id="48" w:name="PlugQty"/>
-            <w:bookmarkEnd w:id="48"/>
+            <w:bookmarkStart w:id="47" w:name="PlugQty"/>
+            <w:bookmarkEnd w:id="47"/>
             <w:r>
               <w:rPr>
                 <w:rFonts w:asciiTheme="majorHAnsi" w:eastAsiaTheme="majorHAnsi" w:hAnsiTheme="majorHAnsi"/>
@@ -15802,8 +15862,8 @@
             </w:r>
           </w:p>
         </w:tc>
-        <w:bookmarkStart w:id="49" w:name="SurveyComp"/>
-        <w:bookmarkEnd w:id="49"/>
+        <w:bookmarkStart w:id="48" w:name="SurveyComp"/>
+        <w:bookmarkEnd w:id="48"/>
         <w:tc>
           <w:tcPr>
             <w:tcW w:w="1570" w:type="pct"/>
@@ -15889,8 +15949,8 @@
             </w:r>
           </w:p>
         </w:tc>
-        <w:bookmarkStart w:id="50" w:name="SurveyTel"/>
-        <w:bookmarkEnd w:id="50"/>
+        <w:bookmarkStart w:id="49" w:name="SurveyTel"/>
+        <w:bookmarkEnd w:id="49"/>
         <w:tc>
           <w:tcPr>
             <w:tcW w:w="1570" w:type="pct"/>
@@ -16044,7 +16104,7 @@
             </w:r>
           </w:p>
         </w:tc>
-        <w:bookmarkStart w:id="51" w:name="SurveyName"/>
+        <w:bookmarkStart w:id="50" w:name="SurveyName"/>
         <w:tc>
           <w:tcPr>
             <w:tcW w:w="1570" w:type="pct"/>
@@ -16109,7 +16169,7 @@
               </w:rPr>
               <w:t xml:space="preserve"> (인)</w:t>
             </w:r>
-            <w:bookmarkEnd w:id="51"/>
+            <w:bookmarkEnd w:id="50"/>
           </w:p>
         </w:tc>
         <w:tc>
@@ -16136,8 +16196,8 @@
             </w:r>
           </w:p>
         </w:tc>
-        <w:bookmarkStart w:id="52" w:name="SurveyDate"/>
-        <w:bookmarkEnd w:id="52"/>
+        <w:bookmarkStart w:id="51" w:name="SurveyDate"/>
+        <w:bookmarkEnd w:id="51"/>
         <w:tc>
           <w:tcPr>
             <w:tcW w:w="1570" w:type="pct"/>
@@ -21884,44 +21944,6 @@
     </w:docPart>
     <w:docPart>
       <w:docPartPr>
-        <w:name w:val="25519F0E27C042B5992368A9A9D880B3"/>
-        <w:category>
-          <w:name w:val="일반"/>
-          <w:gallery w:val="placeholder"/>
-        </w:category>
-        <w:types>
-          <w:type w:val="bbPlcHdr"/>
-        </w:types>
-        <w:behaviors>
-          <w:behavior w:val="content"/>
-        </w:behaviors>
-        <w:guid w:val="{5E59AD49-B56F-4025-B994-C2E3DEB72323}"/>
-      </w:docPartPr>
-      <w:docPartBody>
-        <w:p>
-          <w:pPr>
-            <w:pStyle w:val="25519F0E27C042B5992368A9A9D880B315"/>
-          </w:pPr>
-          <w:r>
-            <w:rPr>
-              <w:rStyle w:val="a3"/>
-              <w:rFonts w:hint="eastAsia"/>
-              <w:b/>
-              <w:bCs/>
-              <w:i/>
-              <w:iCs/>
-              <w:color w:val="A6A6A6" w:themeColor="background1" w:themeShade="A6"/>
-              <w:sz w:val="20"/>
-              <w:szCs w:val="20"/>
-              <w:u w:val="single"/>
-            </w:rPr>
-            <w:t xml:space="preserve">OO </w:t>
-          </w:r>
-        </w:p>
-      </w:docPartBody>
-    </w:docPart>
-    <w:docPart>
-      <w:docPartPr>
         <w:name w:val="0E4CA55FF0CD4A4E8EC5F0A8944461B8"/>
         <w:category>
           <w:name w:val="일반"/>
@@ -23011,7 +23033,9 @@
     <w:rsid w:val="008D2505"/>
     <w:rsid w:val="0096585E"/>
     <w:rsid w:val="009D18C7"/>
+    <w:rsid w:val="00AD60F7"/>
     <w:rsid w:val="00D27F0F"/>
+    <w:rsid w:val="00D3455F"/>
   </w:rsids>
   <m:mathPr>
     <m:mathFont m:val="Cambria Math"/>

</xml_diff>